<commit_message>
Add screenshots to Lab 11 Steps 5-7 and Lab 12 Step 1
Thirteen captures from a live run on 2026-09-27 on one kind cluster carrying
both the CSI hostpath driver and SeaweedFS.

Lab 11 (8): the StorageClass comparison, both expansion phases including the
PVC stuck at FileSystemResizePending with the PV already grown, both refusals,
the multi-attach conflict, the node-affinity mount failure behind it, the
pvc-protection finalizer, and cloning.

Lab 12 (5): all three MinIO images failing to pull, the SeaweedFS backup
location Available, the hostPath trap (Completed with WARNINGS 1 and zero
PodVolumeBackup), the same workload succeeding on a CSI volume, and a full
destroy/restore with the data recovered.

Node names in Lab 11 Steps 6-7 are swapped to match the captured run, with a
note that which worker runs the single driver replica is arbitrary and should
be read from CSINode rather than assumed.

Co-Authored-By: Claude Opus 5 <noreply@anthropic.com>
</commit_message>
<xml_diff>
--- a/day-2-stateful-storage-and-exposure/lab-11-statefulsets-snapshots.docx
+++ b/day-2-stateful-storage-and-exposure/lab-11-statefulsets-snapshots.docx
@@ -1086,7 +1086,7 @@
       </w:r>
     </w:p>
     <w:bookmarkEnd w:id="12"/>
-    <w:bookmarkStart w:id="16" w:name="the-idea-in-60-seconds"/>
+    <w:bookmarkStart w:id="13" w:name="the-idea-in-60-seconds"/>
     <w:p>
       <w:pPr>
         <w:pStyle w:val="Heading2"/>
@@ -1252,557 +1252,566 @@
     </w:p>
     <w:p>
       <w:pPr>
+        <w:pStyle w:val="SourceCode"/>
+      </w:pPr>
+      <w:r>
+        <w:rPr>
+          <w:rStyle w:val="VerbatimChar"/>
+        </w:rPr>
+        <w:t xml:space="preserve">flowchart TB</w:t>
+      </w:r>
+      <w:r>
+        <w:br/>
+      </w:r>
+      <w:r>
+        <w:rPr>
+          <w:rStyle w:val="VerbatimChar"/>
+        </w:rPr>
+        <w:t xml:space="preserve">    SS["StatefulSet db-0"] --&gt; PVC["PVC data-db-0&lt;br/&gt;(pd.csi, 1Gi)"]</w:t>
+      </w:r>
+      <w:r>
+        <w:br/>
+      </w:r>
+      <w:r>
+        <w:rPr>
+          <w:rStyle w:val="VerbatimChar"/>
+        </w:rPr>
+        <w:t xml:space="preserve">    PVC --&gt; PD["real Persistent Disk&lt;br/&gt;/data/message = important-data-v1"]</w:t>
+      </w:r>
+      <w:r>
+        <w:br/>
+      </w:r>
+      <w:r>
+        <w:rPr>
+          <w:rStyle w:val="VerbatimChar"/>
+        </w:rPr>
+        <w:t xml:space="preserve">    PD --&gt;|"VolumeSnapshot"| SNAP["snapshot db-snap&lt;br/&gt;readyToUse = true"]</w:t>
+      </w:r>
+      <w:r>
+        <w:br/>
+      </w:r>
+      <w:r>
+        <w:rPr>
+          <w:rStyle w:val="VerbatimChar"/>
+        </w:rPr>
+        <w:t xml:space="preserve">    PVC -.-&gt;|"delete StatefulSet + PVC"| GONE["volume gone"]</w:t>
+      </w:r>
+      <w:r>
+        <w:br/>
+      </w:r>
+      <w:r>
+        <w:rPr>
+          <w:rStyle w:val="VerbatimChar"/>
+        </w:rPr>
+        <w:t xml:space="preserve">    SNAP --&gt;|"dataSource on a new PVC"| RESTORE["PVC data-restored&lt;br/&gt;/data/message intact"]</w:t>
+      </w:r>
+    </w:p>
+    <w:p>
+      <w:r>
+        <w:pict>
+          <v:rect style="width:0;height:1.5pt" o:hralign="center" o:hrstd="t" o:hr="t"/>
+        </w:pict>
+      </w:r>
+    </w:p>
+    <w:bookmarkEnd w:id="13"/>
+    <w:bookmarkStart w:id="17" w:name="Xffb589b54b5dab2775ec104f4bebac2679053b5"/>
+    <w:p>
+      <w:pPr>
+        <w:pStyle w:val="Heading2"/>
+      </w:pPr>
+      <w:r>
+        <w:t xml:space="preserve">Step 1 — Run a StatefulSet and write data to its volume</w:t>
+      </w:r>
+    </w:p>
+    <w:p>
+      <w:pPr>
+        <w:pStyle w:val="FirstParagraph"/>
+      </w:pPr>
+      <w:r>
+        <w:rPr>
+          <w:b/>
+          <w:bCs/>
+        </w:rPr>
+        <w:t xml:space="preserve">Goal:</w:t>
+      </w:r>
+      <w:r>
+        <w:t xml:space="preserve"> </w:t>
+      </w:r>
+      <w:r>
+        <w:t xml:space="preserve">create a StatefulSet whose Pod has its own persistent disk, and put a known value on it.</w:t>
+      </w:r>
+    </w:p>
+    <w:p>
+      <w:pPr>
+        <w:pStyle w:val="BodyText"/>
+      </w:pPr>
+      <w:r>
+        <w:rPr>
+          <w:b/>
+          <w:bCs/>
+        </w:rPr>
+        <w:t xml:space="preserve">1. Create the StatefulSet (it declares a</w:t>
+      </w:r>
+      <w:r>
+        <w:rPr>
+          <w:b/>
+          <w:bCs/>
+        </w:rPr>
+        <w:t xml:space="preserve"> </w:t>
+      </w:r>
+      <w:r>
+        <w:rPr>
+          <w:rStyle w:val="VerbatimChar"/>
+          <w:b/>
+          <w:bCs/>
+        </w:rPr>
+        <w:t xml:space="preserve">volumeClaimTemplate</w:t>
+      </w:r>
+      <w:r>
+        <w:rPr>
+          <w:b/>
+          <w:bCs/>
+        </w:rPr>
+        <w:t xml:space="preserve">), wait for it, then write a file:</w:t>
+      </w:r>
+    </w:p>
+    <w:p>
+      <w:pPr>
+        <w:pStyle w:val="SourceCode"/>
+      </w:pPr>
+      <w:r>
+        <w:rPr>
+          <w:rStyle w:val="ExtensionTok"/>
+        </w:rPr>
+        <w:t xml:space="preserve">kubectl</w:t>
+      </w:r>
+      <w:r>
+        <w:rPr>
+          <w:rStyle w:val="NormalTok"/>
+        </w:rPr>
+        <w:t xml:space="preserve"> apply </w:t>
+      </w:r>
+      <w:r>
+        <w:rPr>
+          <w:rStyle w:val="AttributeTok"/>
+        </w:rPr>
+        <w:t xml:space="preserve">-f</w:t>
+      </w:r>
+      <w:r>
+        <w:rPr>
+          <w:rStyle w:val="NormalTok"/>
+        </w:rPr>
+        <w:t xml:space="preserve"> </w:t>
+      </w:r>
+      <w:r>
+        <w:rPr>
+          <w:rStyle w:val="AttributeTok"/>
+        </w:rPr>
+        <w:t xml:space="preserve">-</w:t>
+      </w:r>
+      <w:r>
+        <w:rPr>
+          <w:rStyle w:val="NormalTok"/>
+        </w:rPr>
+        <w:t xml:space="preserve"> </w:t>
+      </w:r>
+      <w:r>
+        <w:rPr>
+          <w:rStyle w:val="OperatorTok"/>
+        </w:rPr>
+        <w:t xml:space="preserve">&lt;&lt;'EOF'</w:t>
+      </w:r>
+      <w:r>
+        <w:br/>
+      </w:r>
+      <w:r>
+        <w:rPr>
+          <w:rStyle w:val="StringTok"/>
+        </w:rPr>
+        <w:t xml:space="preserve">apiVersion: apps/v1</w:t>
+      </w:r>
+      <w:r>
+        <w:br/>
+      </w:r>
+      <w:r>
+        <w:rPr>
+          <w:rStyle w:val="StringTok"/>
+        </w:rPr>
+        <w:t xml:space="preserve">kind: StatefulSet</w:t>
+      </w:r>
+      <w:r>
+        <w:br/>
+      </w:r>
+      <w:r>
+        <w:rPr>
+          <w:rStyle w:val="StringTok"/>
+        </w:rPr>
+        <w:t xml:space="preserve">metadata: {name: db}</w:t>
+      </w:r>
+      <w:r>
+        <w:br/>
+      </w:r>
+      <w:r>
+        <w:rPr>
+          <w:rStyle w:val="StringTok"/>
+        </w:rPr>
+        <w:t xml:space="preserve">spec:</w:t>
+      </w:r>
+      <w:r>
+        <w:br/>
+      </w:r>
+      <w:r>
+        <w:rPr>
+          <w:rStyle w:val="StringTok"/>
+        </w:rPr>
+        <w:t xml:space="preserve">  serviceName: db</w:t>
+      </w:r>
+      <w:r>
+        <w:br/>
+      </w:r>
+      <w:r>
+        <w:rPr>
+          <w:rStyle w:val="StringTok"/>
+        </w:rPr>
+        <w:t xml:space="preserve">  replicas: 1</w:t>
+      </w:r>
+      <w:r>
+        <w:br/>
+      </w:r>
+      <w:r>
+        <w:rPr>
+          <w:rStyle w:val="StringTok"/>
+        </w:rPr>
+        <w:t xml:space="preserve">  selector: {matchLabels: {app: db}}</w:t>
+      </w:r>
+      <w:r>
+        <w:br/>
+      </w:r>
+      <w:r>
+        <w:rPr>
+          <w:rStyle w:val="StringTok"/>
+        </w:rPr>
+        <w:t xml:space="preserve">  template:</w:t>
+      </w:r>
+      <w:r>
+        <w:br/>
+      </w:r>
+      <w:r>
+        <w:rPr>
+          <w:rStyle w:val="StringTok"/>
+        </w:rPr>
+        <w:t xml:space="preserve">    metadata: {labels: {app: db}}</w:t>
+      </w:r>
+      <w:r>
+        <w:br/>
+      </w:r>
+      <w:r>
+        <w:rPr>
+          <w:rStyle w:val="StringTok"/>
+        </w:rPr>
+        <w:t xml:space="preserve">    spec:</w:t>
+      </w:r>
+      <w:r>
+        <w:br/>
+      </w:r>
+      <w:r>
+        <w:rPr>
+          <w:rStyle w:val="StringTok"/>
+        </w:rPr>
+        <w:t xml:space="preserve">      containers:</w:t>
+      </w:r>
+      <w:r>
+        <w:br/>
+      </w:r>
+      <w:r>
+        <w:rPr>
+          <w:rStyle w:val="StringTok"/>
+        </w:rPr>
+        <w:t xml:space="preserve">        - name: app</w:t>
+      </w:r>
+      <w:r>
+        <w:br/>
+      </w:r>
+      <w:r>
+        <w:rPr>
+          <w:rStyle w:val="StringTok"/>
+        </w:rPr>
+        <w:t xml:space="preserve">          image: busybox:1.36</w:t>
+      </w:r>
+      <w:r>
+        <w:br/>
+      </w:r>
+      <w:r>
+        <w:rPr>
+          <w:rStyle w:val="StringTok"/>
+        </w:rPr>
+        <w:t xml:space="preserve">          command: ["sh","-c","sleep 3600"]</w:t>
+      </w:r>
+      <w:r>
+        <w:br/>
+      </w:r>
+      <w:r>
+        <w:rPr>
+          <w:rStyle w:val="StringTok"/>
+        </w:rPr>
+        <w:t xml:space="preserve">          volumeMounts: [{name: data, mountPath: /data}]</w:t>
+      </w:r>
+      <w:r>
+        <w:br/>
+      </w:r>
+      <w:r>
+        <w:rPr>
+          <w:rStyle w:val="StringTok"/>
+        </w:rPr>
+        <w:t xml:space="preserve">  volumeClaimTemplates:</w:t>
+      </w:r>
+      <w:r>
+        <w:br/>
+      </w:r>
+      <w:r>
+        <w:rPr>
+          <w:rStyle w:val="StringTok"/>
+        </w:rPr>
+        <w:t xml:space="preserve">    - metadata: {name: data}</w:t>
+      </w:r>
+      <w:r>
+        <w:br/>
+      </w:r>
+      <w:r>
+        <w:rPr>
+          <w:rStyle w:val="StringTok"/>
+        </w:rPr>
+        <w:t xml:space="preserve">      spec:</w:t>
+      </w:r>
+      <w:r>
+        <w:br/>
+      </w:r>
+      <w:r>
+        <w:rPr>
+          <w:rStyle w:val="StringTok"/>
+        </w:rPr>
+        <w:t xml:space="preserve">        accessModes: ["ReadWriteOnce"]</w:t>
+      </w:r>
+      <w:r>
+        <w:br/>
+      </w:r>
+      <w:r>
+        <w:rPr>
+          <w:rStyle w:val="StringTok"/>
+        </w:rPr>
+        <w:t xml:space="preserve">        storageClassName: standard-rwo</w:t>
+      </w:r>
+      <w:r>
+        <w:br/>
+      </w:r>
+      <w:r>
+        <w:rPr>
+          <w:rStyle w:val="StringTok"/>
+        </w:rPr>
+        <w:t xml:space="preserve">        resources: {requests: {storage: 1Gi}}</w:t>
+      </w:r>
+      <w:r>
+        <w:br/>
+      </w:r>
+      <w:r>
+        <w:rPr>
+          <w:rStyle w:val="OperatorTok"/>
+        </w:rPr>
+        <w:t xml:space="preserve">EOF</w:t>
+      </w:r>
+      <w:r>
+        <w:br/>
+      </w:r>
+      <w:r>
+        <w:rPr>
+          <w:rStyle w:val="ExtensionTok"/>
+        </w:rPr>
+        <w:t xml:space="preserve">kubectl</w:t>
+      </w:r>
+      <w:r>
+        <w:rPr>
+          <w:rStyle w:val="NormalTok"/>
+        </w:rPr>
+        <w:t xml:space="preserve"> rollout status statefulset/db </w:t>
+      </w:r>
+      <w:r>
+        <w:rPr>
+          <w:rStyle w:val="AttributeTok"/>
+        </w:rPr>
+        <w:t xml:space="preserve">--timeout</w:t>
+      </w:r>
+      <w:r>
+        <w:rPr>
+          <w:rStyle w:val="OperatorTok"/>
+        </w:rPr>
+        <w:t xml:space="preserve">=</w:t>
+      </w:r>
+      <w:r>
+        <w:rPr>
+          <w:rStyle w:val="NormalTok"/>
+        </w:rPr>
+        <w:t xml:space="preserve">120s</w:t>
+      </w:r>
+      <w:r>
+        <w:br/>
+      </w:r>
+      <w:r>
+        <w:br/>
+      </w:r>
+      <w:r>
+        <w:rPr>
+          <w:rStyle w:val="ExtensionTok"/>
+        </w:rPr>
+        <w:t xml:space="preserve">kubectl</w:t>
+      </w:r>
+      <w:r>
+        <w:rPr>
+          <w:rStyle w:val="NormalTok"/>
+        </w:rPr>
+        <w:t xml:space="preserve"> exec db-0 </w:t>
+      </w:r>
+      <w:r>
+        <w:rPr>
+          <w:rStyle w:val="AttributeTok"/>
+        </w:rPr>
+        <w:t xml:space="preserve">--</w:t>
+      </w:r>
+      <w:r>
+        <w:rPr>
+          <w:rStyle w:val="NormalTok"/>
+        </w:rPr>
+        <w:t xml:space="preserve"> sh </w:t>
+      </w:r>
+      <w:r>
+        <w:rPr>
+          <w:rStyle w:val="AttributeTok"/>
+        </w:rPr>
+        <w:t xml:space="preserve">-c</w:t>
+      </w:r>
+      <w:r>
+        <w:rPr>
+          <w:rStyle w:val="NormalTok"/>
+        </w:rPr>
+        <w:t xml:space="preserve"> </w:t>
+      </w:r>
+      <w:r>
+        <w:rPr>
+          <w:rStyle w:val="StringTok"/>
+        </w:rPr>
+        <w:t xml:space="preserve">'echo "important-data-v1" &gt; /data/message; cat /data/message'</w:t>
+      </w:r>
+      <w:r>
+        <w:br/>
+      </w:r>
+      <w:r>
+        <w:rPr>
+          <w:rStyle w:val="ExtensionTok"/>
+        </w:rPr>
+        <w:t xml:space="preserve">kubectl</w:t>
+      </w:r>
+      <w:r>
+        <w:rPr>
+          <w:rStyle w:val="NormalTok"/>
+        </w:rPr>
+        <w:t xml:space="preserve"> get pvc data-db-0</w:t>
+      </w:r>
+    </w:p>
+    <w:p>
+      <w:pPr>
+        <w:pStyle w:val="FirstParagraph"/>
+      </w:pPr>
+      <w:r>
+        <w:rPr>
+          <w:b/>
+          <w:bCs/>
+        </w:rPr>
+        <w:t xml:space="preserve">What you should see:</w:t>
+      </w:r>
+      <w:r>
+        <w:t xml:space="preserve"> </w:t>
+      </w:r>
+      <w:r>
+        <w:t xml:space="preserve">the rollout completes,</w:t>
+      </w:r>
+      <w:r>
+        <w:t xml:space="preserve"> </w:t>
+      </w:r>
+      <w:r>
+        <w:rPr>
+          <w:rStyle w:val="VerbatimChar"/>
+        </w:rPr>
+        <w:t xml:space="preserve">cat /data/message</w:t>
+      </w:r>
+      <w:r>
+        <w:t xml:space="preserve"> </w:t>
+      </w:r>
+      <w:r>
+        <w:t xml:space="preserve">prints</w:t>
+      </w:r>
+      <w:r>
+        <w:t xml:space="preserve"> </w:t>
+      </w:r>
+      <w:r>
+        <w:rPr>
+          <w:rStyle w:val="VerbatimChar"/>
+        </w:rPr>
+        <w:t xml:space="preserve">important-data-v1</w:t>
+      </w:r>
+      <w:r>
+        <w:t xml:space="preserve">, and</w:t>
+      </w:r>
+      <w:r>
+        <w:t xml:space="preserve"> </w:t>
+      </w:r>
+      <w:r>
+        <w:rPr>
+          <w:rStyle w:val="VerbatimChar"/>
+        </w:rPr>
+        <w:t xml:space="preserve">kubectl get pvc data-db-0</w:t>
+      </w:r>
+      <w:r>
+        <w:t xml:space="preserve"> </w:t>
+      </w:r>
+      <w:r>
+        <w:t xml:space="preserve">shows a</w:t>
+      </w:r>
+      <w:r>
+        <w:t xml:space="preserve"> </w:t>
+      </w:r>
+      <w:r>
+        <w:rPr>
+          <w:rStyle w:val="VerbatimChar"/>
+        </w:rPr>
+        <w:t xml:space="preserve">Bound</w:t>
+      </w:r>
+      <w:r>
+        <w:t xml:space="preserve"> </w:t>
+      </w:r>
+      <w:r>
+        <w:t xml:space="preserve">1Gi PVC.</w:t>
+      </w:r>
+    </w:p>
+    <w:p>
+      <w:pPr>
         <w:pStyle w:val="BodyText"/>
       </w:pPr>
       <w:r>
         <w:drawing>
           <wp:inline>
-            <wp:extent cx="5943600" cy="8240819"/>
+            <wp:extent cx="5943600" cy="4116751"/>
             <wp:effectExtent b="0" l="0" r="0" t="0"/>
-            <wp:docPr descr="Architecture diagram" title="" id="14" name="Picture"/>
+            <wp:docPr descr="StatefulSet running, data written, PVC bound" title="" id="15" name="Picture"/>
             <a:graphic>
               <a:graphicData uri="http://schemas.openxmlformats.org/drawingml/2006/picture">
                 <pic:pic>
                   <pic:nvPicPr>
-                    <pic:cNvPr descr="artifacts/lab-11/diagrams/diagram.png" id="15" name="Picture"/>
+                    <pic:cNvPr descr="../artifacts/lab-11/screenshots/01-statefulset-data.png" id="16" name="Picture"/>
                     <pic:cNvPicPr>
                       <a:picLocks noChangeArrowheads="1" noChangeAspect="1"/>
                     </pic:cNvPicPr>
                   </pic:nvPicPr>
                   <pic:blipFill>
-                    <a:blip r:embed="rId13"/>
-                    <a:stretch>
-                      <a:fillRect/>
-                    </a:stretch>
-                  </pic:blipFill>
-                  <pic:spPr bwMode="auto">
-                    <a:xfrm>
-                      <a:off x="0" y="0"/>
-                      <a:ext cx="5943600" cy="8240819"/>
-                    </a:xfrm>
-                    <a:prstGeom prst="rect">
-                      <a:avLst/>
-                    </a:prstGeom>
-                    <a:noFill/>
-                    <a:ln w="9525">
-                      <a:noFill/>
-                      <a:headEnd/>
-                      <a:tailEnd/>
-                    </a:ln>
-                  </pic:spPr>
-                </pic:pic>
-              </a:graphicData>
-            </a:graphic>
-          </wp:inline>
-        </w:drawing>
-      </w:r>
-    </w:p>
-    <w:p>
-      <w:r>
-        <w:pict>
-          <v:rect style="width:0;height:1.5pt" o:hralign="center" o:hrstd="t" o:hr="t"/>
-        </w:pict>
-      </w:r>
-    </w:p>
-    <w:bookmarkEnd w:id="16"/>
-    <w:bookmarkStart w:id="20" w:name="Xffb589b54b5dab2775ec104f4bebac2679053b5"/>
-    <w:p>
-      <w:pPr>
-        <w:pStyle w:val="Heading2"/>
-      </w:pPr>
-      <w:r>
-        <w:t xml:space="preserve">Step 1 — Run a StatefulSet and write data to its volume</w:t>
-      </w:r>
-    </w:p>
-    <w:p>
-      <w:pPr>
-        <w:pStyle w:val="FirstParagraph"/>
-      </w:pPr>
-      <w:r>
-        <w:rPr>
-          <w:b/>
-          <w:bCs/>
-        </w:rPr>
-        <w:t xml:space="preserve">Goal:</w:t>
-      </w:r>
-      <w:r>
-        <w:t xml:space="preserve"> </w:t>
-      </w:r>
-      <w:r>
-        <w:t xml:space="preserve">create a StatefulSet whose Pod has its own persistent disk, and put a known value on it.</w:t>
-      </w:r>
-    </w:p>
-    <w:p>
-      <w:pPr>
-        <w:pStyle w:val="BodyText"/>
-      </w:pPr>
-      <w:r>
-        <w:rPr>
-          <w:b/>
-          <w:bCs/>
-        </w:rPr>
-        <w:t xml:space="preserve">1. Create the StatefulSet (it declares a</w:t>
-      </w:r>
-      <w:r>
-        <w:rPr>
-          <w:b/>
-          <w:bCs/>
-        </w:rPr>
-        <w:t xml:space="preserve"> </w:t>
-      </w:r>
-      <w:r>
-        <w:rPr>
-          <w:rStyle w:val="VerbatimChar"/>
-          <w:b/>
-          <w:bCs/>
-        </w:rPr>
-        <w:t xml:space="preserve">volumeClaimTemplate</w:t>
-      </w:r>
-      <w:r>
-        <w:rPr>
-          <w:b/>
-          <w:bCs/>
-        </w:rPr>
-        <w:t xml:space="preserve">), wait for it, then write a file:</w:t>
-      </w:r>
-    </w:p>
-    <w:p>
-      <w:pPr>
-        <w:pStyle w:val="SourceCode"/>
-      </w:pPr>
-      <w:r>
-        <w:rPr>
-          <w:rStyle w:val="ExtensionTok"/>
-        </w:rPr>
-        <w:t xml:space="preserve">kubectl</w:t>
-      </w:r>
-      <w:r>
-        <w:rPr>
-          <w:rStyle w:val="NormalTok"/>
-        </w:rPr>
-        <w:t xml:space="preserve"> apply </w:t>
-      </w:r>
-      <w:r>
-        <w:rPr>
-          <w:rStyle w:val="AttributeTok"/>
-        </w:rPr>
-        <w:t xml:space="preserve">-f</w:t>
-      </w:r>
-      <w:r>
-        <w:rPr>
-          <w:rStyle w:val="NormalTok"/>
-        </w:rPr>
-        <w:t xml:space="preserve"> </w:t>
-      </w:r>
-      <w:r>
-        <w:rPr>
-          <w:rStyle w:val="AttributeTok"/>
-        </w:rPr>
-        <w:t xml:space="preserve">-</w:t>
-      </w:r>
-      <w:r>
-        <w:rPr>
-          <w:rStyle w:val="NormalTok"/>
-        </w:rPr>
-        <w:t xml:space="preserve"> </w:t>
-      </w:r>
-      <w:r>
-        <w:rPr>
-          <w:rStyle w:val="OperatorTok"/>
-        </w:rPr>
-        <w:t xml:space="preserve">&lt;&lt;'EOF'</w:t>
-      </w:r>
-      <w:r>
-        <w:br/>
-      </w:r>
-      <w:r>
-        <w:rPr>
-          <w:rStyle w:val="StringTok"/>
-        </w:rPr>
-        <w:t xml:space="preserve">apiVersion: apps/v1</w:t>
-      </w:r>
-      <w:r>
-        <w:br/>
-      </w:r>
-      <w:r>
-        <w:rPr>
-          <w:rStyle w:val="StringTok"/>
-        </w:rPr>
-        <w:t xml:space="preserve">kind: StatefulSet</w:t>
-      </w:r>
-      <w:r>
-        <w:br/>
-      </w:r>
-      <w:r>
-        <w:rPr>
-          <w:rStyle w:val="StringTok"/>
-        </w:rPr>
-        <w:t xml:space="preserve">metadata: {name: db}</w:t>
-      </w:r>
-      <w:r>
-        <w:br/>
-      </w:r>
-      <w:r>
-        <w:rPr>
-          <w:rStyle w:val="StringTok"/>
-        </w:rPr>
-        <w:t xml:space="preserve">spec:</w:t>
-      </w:r>
-      <w:r>
-        <w:br/>
-      </w:r>
-      <w:r>
-        <w:rPr>
-          <w:rStyle w:val="StringTok"/>
-        </w:rPr>
-        <w:t xml:space="preserve">  serviceName: db</w:t>
-      </w:r>
-      <w:r>
-        <w:br/>
-      </w:r>
-      <w:r>
-        <w:rPr>
-          <w:rStyle w:val="StringTok"/>
-        </w:rPr>
-        <w:t xml:space="preserve">  replicas: 1</w:t>
-      </w:r>
-      <w:r>
-        <w:br/>
-      </w:r>
-      <w:r>
-        <w:rPr>
-          <w:rStyle w:val="StringTok"/>
-        </w:rPr>
-        <w:t xml:space="preserve">  selector: {matchLabels: {app: db}}</w:t>
-      </w:r>
-      <w:r>
-        <w:br/>
-      </w:r>
-      <w:r>
-        <w:rPr>
-          <w:rStyle w:val="StringTok"/>
-        </w:rPr>
-        <w:t xml:space="preserve">  template:</w:t>
-      </w:r>
-      <w:r>
-        <w:br/>
-      </w:r>
-      <w:r>
-        <w:rPr>
-          <w:rStyle w:val="StringTok"/>
-        </w:rPr>
-        <w:t xml:space="preserve">    metadata: {labels: {app: db}}</w:t>
-      </w:r>
-      <w:r>
-        <w:br/>
-      </w:r>
-      <w:r>
-        <w:rPr>
-          <w:rStyle w:val="StringTok"/>
-        </w:rPr>
-        <w:t xml:space="preserve">    spec:</w:t>
-      </w:r>
-      <w:r>
-        <w:br/>
-      </w:r>
-      <w:r>
-        <w:rPr>
-          <w:rStyle w:val="StringTok"/>
-        </w:rPr>
-        <w:t xml:space="preserve">      containers:</w:t>
-      </w:r>
-      <w:r>
-        <w:br/>
-      </w:r>
-      <w:r>
-        <w:rPr>
-          <w:rStyle w:val="StringTok"/>
-        </w:rPr>
-        <w:t xml:space="preserve">        - name: app</w:t>
-      </w:r>
-      <w:r>
-        <w:br/>
-      </w:r>
-      <w:r>
-        <w:rPr>
-          <w:rStyle w:val="StringTok"/>
-        </w:rPr>
-        <w:t xml:space="preserve">          image: busybox:1.36</w:t>
-      </w:r>
-      <w:r>
-        <w:br/>
-      </w:r>
-      <w:r>
-        <w:rPr>
-          <w:rStyle w:val="StringTok"/>
-        </w:rPr>
-        <w:t xml:space="preserve">          command: ["sh","-c","sleep 3600"]</w:t>
-      </w:r>
-      <w:r>
-        <w:br/>
-      </w:r>
-      <w:r>
-        <w:rPr>
-          <w:rStyle w:val="StringTok"/>
-        </w:rPr>
-        <w:t xml:space="preserve">          volumeMounts: [{name: data, mountPath: /data}]</w:t>
-      </w:r>
-      <w:r>
-        <w:br/>
-      </w:r>
-      <w:r>
-        <w:rPr>
-          <w:rStyle w:val="StringTok"/>
-        </w:rPr>
-        <w:t xml:space="preserve">  volumeClaimTemplates:</w:t>
-      </w:r>
-      <w:r>
-        <w:br/>
-      </w:r>
-      <w:r>
-        <w:rPr>
-          <w:rStyle w:val="StringTok"/>
-        </w:rPr>
-        <w:t xml:space="preserve">    - metadata: {name: data}</w:t>
-      </w:r>
-      <w:r>
-        <w:br/>
-      </w:r>
-      <w:r>
-        <w:rPr>
-          <w:rStyle w:val="StringTok"/>
-        </w:rPr>
-        <w:t xml:space="preserve">      spec:</w:t>
-      </w:r>
-      <w:r>
-        <w:br/>
-      </w:r>
-      <w:r>
-        <w:rPr>
-          <w:rStyle w:val="StringTok"/>
-        </w:rPr>
-        <w:t xml:space="preserve">        accessModes: ["ReadWriteOnce"]</w:t>
-      </w:r>
-      <w:r>
-        <w:br/>
-      </w:r>
-      <w:r>
-        <w:rPr>
-          <w:rStyle w:val="StringTok"/>
-        </w:rPr>
-        <w:t xml:space="preserve">        storageClassName: standard-rwo</w:t>
-      </w:r>
-      <w:r>
-        <w:br/>
-      </w:r>
-      <w:r>
-        <w:rPr>
-          <w:rStyle w:val="StringTok"/>
-        </w:rPr>
-        <w:t xml:space="preserve">        resources: {requests: {storage: 1Gi}}</w:t>
-      </w:r>
-      <w:r>
-        <w:br/>
-      </w:r>
-      <w:r>
-        <w:rPr>
-          <w:rStyle w:val="OperatorTok"/>
-        </w:rPr>
-        <w:t xml:space="preserve">EOF</w:t>
-      </w:r>
-      <w:r>
-        <w:br/>
-      </w:r>
-      <w:r>
-        <w:rPr>
-          <w:rStyle w:val="ExtensionTok"/>
-        </w:rPr>
-        <w:t xml:space="preserve">kubectl</w:t>
-      </w:r>
-      <w:r>
-        <w:rPr>
-          <w:rStyle w:val="NormalTok"/>
-        </w:rPr>
-        <w:t xml:space="preserve"> rollout status statefulset/db </w:t>
-      </w:r>
-      <w:r>
-        <w:rPr>
-          <w:rStyle w:val="AttributeTok"/>
-        </w:rPr>
-        <w:t xml:space="preserve">--timeout</w:t>
-      </w:r>
-      <w:r>
-        <w:rPr>
-          <w:rStyle w:val="OperatorTok"/>
-        </w:rPr>
-        <w:t xml:space="preserve">=</w:t>
-      </w:r>
-      <w:r>
-        <w:rPr>
-          <w:rStyle w:val="NormalTok"/>
-        </w:rPr>
-        <w:t xml:space="preserve">120s</w:t>
-      </w:r>
-      <w:r>
-        <w:br/>
-      </w:r>
-      <w:r>
-        <w:br/>
-      </w:r>
-      <w:r>
-        <w:rPr>
-          <w:rStyle w:val="ExtensionTok"/>
-        </w:rPr>
-        <w:t xml:space="preserve">kubectl</w:t>
-      </w:r>
-      <w:r>
-        <w:rPr>
-          <w:rStyle w:val="NormalTok"/>
-        </w:rPr>
-        <w:t xml:space="preserve"> exec db-0 </w:t>
-      </w:r>
-      <w:r>
-        <w:rPr>
-          <w:rStyle w:val="AttributeTok"/>
-        </w:rPr>
-        <w:t xml:space="preserve">--</w:t>
-      </w:r>
-      <w:r>
-        <w:rPr>
-          <w:rStyle w:val="NormalTok"/>
-        </w:rPr>
-        <w:t xml:space="preserve"> sh </w:t>
-      </w:r>
-      <w:r>
-        <w:rPr>
-          <w:rStyle w:val="AttributeTok"/>
-        </w:rPr>
-        <w:t xml:space="preserve">-c</w:t>
-      </w:r>
-      <w:r>
-        <w:rPr>
-          <w:rStyle w:val="NormalTok"/>
-        </w:rPr>
-        <w:t xml:space="preserve"> </w:t>
-      </w:r>
-      <w:r>
-        <w:rPr>
-          <w:rStyle w:val="StringTok"/>
-        </w:rPr>
-        <w:t xml:space="preserve">'echo "important-data-v1" &gt; /data/message; cat /data/message'</w:t>
-      </w:r>
-      <w:r>
-        <w:br/>
-      </w:r>
-      <w:r>
-        <w:rPr>
-          <w:rStyle w:val="ExtensionTok"/>
-        </w:rPr>
-        <w:t xml:space="preserve">kubectl</w:t>
-      </w:r>
-      <w:r>
-        <w:rPr>
-          <w:rStyle w:val="NormalTok"/>
-        </w:rPr>
-        <w:t xml:space="preserve"> get pvc data-db-0</w:t>
-      </w:r>
-    </w:p>
-    <w:p>
-      <w:pPr>
-        <w:pStyle w:val="FirstParagraph"/>
-      </w:pPr>
-      <w:r>
-        <w:rPr>
-          <w:b/>
-          <w:bCs/>
-        </w:rPr>
-        <w:t xml:space="preserve">What you should see:</w:t>
-      </w:r>
-      <w:r>
-        <w:t xml:space="preserve"> </w:t>
-      </w:r>
-      <w:r>
-        <w:t xml:space="preserve">the rollout completes,</w:t>
-      </w:r>
-      <w:r>
-        <w:t xml:space="preserve"> </w:t>
-      </w:r>
-      <w:r>
-        <w:rPr>
-          <w:rStyle w:val="VerbatimChar"/>
-        </w:rPr>
-        <w:t xml:space="preserve">cat /data/message</w:t>
-      </w:r>
-      <w:r>
-        <w:t xml:space="preserve"> </w:t>
-      </w:r>
-      <w:r>
-        <w:t xml:space="preserve">prints</w:t>
-      </w:r>
-      <w:r>
-        <w:t xml:space="preserve"> </w:t>
-      </w:r>
-      <w:r>
-        <w:rPr>
-          <w:rStyle w:val="VerbatimChar"/>
-        </w:rPr>
-        <w:t xml:space="preserve">important-data-v1</w:t>
-      </w:r>
-      <w:r>
-        <w:t xml:space="preserve">, and</w:t>
-      </w:r>
-      <w:r>
-        <w:t xml:space="preserve"> </w:t>
-      </w:r>
-      <w:r>
-        <w:rPr>
-          <w:rStyle w:val="VerbatimChar"/>
-        </w:rPr>
-        <w:t xml:space="preserve">kubectl get pvc data-db-0</w:t>
-      </w:r>
-      <w:r>
-        <w:t xml:space="preserve"> </w:t>
-      </w:r>
-      <w:r>
-        <w:t xml:space="preserve">shows a</w:t>
-      </w:r>
-      <w:r>
-        <w:t xml:space="preserve"> </w:t>
-      </w:r>
-      <w:r>
-        <w:rPr>
-          <w:rStyle w:val="VerbatimChar"/>
-        </w:rPr>
-        <w:t xml:space="preserve">Bound</w:t>
-      </w:r>
-      <w:r>
-        <w:t xml:space="preserve"> </w:t>
-      </w:r>
-      <w:r>
-        <w:t xml:space="preserve">1Gi PVC.</w:t>
-      </w:r>
-    </w:p>
-    <w:p>
-      <w:pPr>
-        <w:pStyle w:val="BodyText"/>
-      </w:pPr>
-      <w:r>
-        <w:drawing>
-          <wp:inline>
-            <wp:extent cx="5943600" cy="4116751"/>
-            <wp:effectExtent b="0" l="0" r="0" t="0"/>
-            <wp:docPr descr="StatefulSet running, data written, PVC bound" title="" id="18" name="Picture"/>
-            <a:graphic>
-              <a:graphicData uri="http://schemas.openxmlformats.org/drawingml/2006/picture">
-                <pic:pic>
-                  <pic:nvPicPr>
-                    <pic:cNvPr descr="../artifacts/lab-11/screenshots/01-statefulset-data.png" id="19" name="Picture"/>
-                    <pic:cNvPicPr>
-                      <a:picLocks noChangeArrowheads="1" noChangeAspect="1"/>
-                    </pic:cNvPicPr>
-                  </pic:nvPicPr>
-                  <pic:blipFill>
-                    <a:blip r:embed="rId17"/>
+                    <a:blip r:embed="rId14"/>
                     <a:stretch>
                       <a:fillRect/>
                     </a:stretch>
@@ -1869,8 +1878,8 @@
         </w:pict>
       </w:r>
     </w:p>
-    <w:bookmarkEnd w:id="20"/>
-    <w:bookmarkStart w:id="24" w:name="step-2--snapshot-the-volume"/>
+    <w:bookmarkEnd w:id="17"/>
+    <w:bookmarkStart w:id="21" w:name="step-2--snapshot-the-volume"/>
     <w:p>
       <w:pPr>
         <w:pStyle w:val="Heading2"/>
@@ -2309,18 +2318,18 @@
           <wp:inline>
             <wp:extent cx="5943600" cy="4116751"/>
             <wp:effectExtent b="0" l="0" r="0" t="0"/>
-            <wp:docPr descr="Snapshot readyToUse=true, restoreSize 1Gi" title="" id="22" name="Picture"/>
+            <wp:docPr descr="Snapshot readyToUse=true, restoreSize 1Gi" title="" id="19" name="Picture"/>
             <a:graphic>
               <a:graphicData uri="http://schemas.openxmlformats.org/drawingml/2006/picture">
                 <pic:pic>
                   <pic:nvPicPr>
-                    <pic:cNvPr descr="../artifacts/lab-11/screenshots/02-snapshot-ready.png" id="23" name="Picture"/>
+                    <pic:cNvPr descr="../artifacts/lab-11/screenshots/02-snapshot-ready.png" id="20" name="Picture"/>
                     <pic:cNvPicPr>
                       <a:picLocks noChangeArrowheads="1" noChangeAspect="1"/>
                     </pic:cNvPicPr>
                   </pic:nvPicPr>
                   <pic:blipFill>
-                    <a:blip r:embed="rId21"/>
+                    <a:blip r:embed="rId18"/>
                     <a:stretch>
                       <a:fillRect/>
                     </a:stretch>
@@ -2372,8 +2381,8 @@
         </w:pict>
       </w:r>
     </w:p>
-    <w:bookmarkEnd w:id="24"/>
-    <w:bookmarkStart w:id="28" w:name="step-3--simulate-a-disaster"/>
+    <w:bookmarkEnd w:id="21"/>
+    <w:bookmarkStart w:id="25" w:name="step-3--simulate-a-disaster"/>
     <w:p>
       <w:pPr>
         <w:pStyle w:val="Heading2"/>
@@ -2535,18 +2544,18 @@
           <wp:inline>
             <wp:extent cx="5943600" cy="4116751"/>
             <wp:effectExtent b="0" l="0" r="0" t="0"/>
-            <wp:docPr descr="StatefulSet and PVC deleted; snapshot survives" title="" id="26" name="Picture"/>
+            <wp:docPr descr="StatefulSet and PVC deleted; snapshot survives" title="" id="23" name="Picture"/>
             <a:graphic>
               <a:graphicData uri="http://schemas.openxmlformats.org/drawingml/2006/picture">
                 <pic:pic>
                   <pic:nvPicPr>
-                    <pic:cNvPr descr="../artifacts/lab-11/screenshots/03-destroyed.png" id="27" name="Picture"/>
+                    <pic:cNvPr descr="../artifacts/lab-11/screenshots/03-destroyed.png" id="24" name="Picture"/>
                     <pic:cNvPicPr>
                       <a:picLocks noChangeArrowheads="1" noChangeAspect="1"/>
                     </pic:cNvPicPr>
                   </pic:nvPicPr>
                   <pic:blipFill>
-                    <a:blip r:embed="rId25"/>
+                    <a:blip r:embed="rId22"/>
                     <a:stretch>
                       <a:fillRect/>
                     </a:stretch>
@@ -2598,8 +2607,8 @@
         </w:pict>
       </w:r>
     </w:p>
-    <w:bookmarkEnd w:id="28"/>
-    <w:bookmarkStart w:id="33" w:name="X4ad7b7ce2eedf73128e6ed6abec4c34eb3e4588"/>
+    <w:bookmarkEnd w:id="25"/>
+    <w:bookmarkStart w:id="30" w:name="X4ad7b7ce2eedf73128e6ed6abec4c34eb3e4588"/>
     <w:p>
       <w:pPr>
         <w:pStyle w:val="Heading2"/>
@@ -3021,18 +3030,18 @@
           <wp:inline>
             <wp:extent cx="5943600" cy="4116751"/>
             <wp:effectExtent b="0" l="0" r="0" t="0"/>
-            <wp:docPr descr="Restored volume — original data intact" title="" id="30" name="Picture"/>
+            <wp:docPr descr="Restored volume — original data intact" title="" id="27" name="Picture"/>
             <a:graphic>
               <a:graphicData uri="http://schemas.openxmlformats.org/drawingml/2006/picture">
                 <pic:pic>
                   <pic:nvPicPr>
-                    <pic:cNvPr descr="../artifacts/lab-11/screenshots/04-restored-verified.png" id="31" name="Picture"/>
+                    <pic:cNvPr descr="../artifacts/lab-11/screenshots/04-restored-verified.png" id="28" name="Picture"/>
                     <pic:cNvPicPr>
                       <a:picLocks noChangeArrowheads="1" noChangeAspect="1"/>
                     </pic:cNvPicPr>
                   </pic:nvPicPr>
                   <pic:blipFill>
-                    <a:blip r:embed="rId29"/>
+                    <a:blip r:embed="rId26"/>
                     <a:stretch>
                       <a:fillRect/>
                     </a:stretch>
@@ -3159,7 +3168,7 @@
       <w:r>
         <w:t xml:space="preserve"> </w:t>
       </w:r>
-      <w:hyperlink r:id="rId32">
+      <w:hyperlink r:id="rId29">
         <w:r>
           <w:rPr>
             <w:rStyle w:val="Hyperlink"/>
@@ -3178,7 +3187,7 @@
         </w:pict>
       </w:r>
     </w:p>
-    <w:bookmarkEnd w:id="33"/>
+    <w:bookmarkEnd w:id="30"/>
     <w:bookmarkStart w:id="35" w:name="X3ea540206ca679e9e30d6779a445fff9357053c"/>
     <w:p>
       <w:pPr>
@@ -3403,6 +3412,53 @@
       </w:r>
       <w:r>
         <w:t xml:space="preserve">instead:</w:t>
+      </w:r>
+    </w:p>
+    <w:p>
+      <w:pPr>
+        <w:pStyle w:val="BodyText"/>
+      </w:pPr>
+      <w:r>
+        <w:drawing>
+          <wp:inline>
+            <wp:extent cx="5943600" cy="694320"/>
+            <wp:effectExtent b="0" l="0" r="0" t="0"/>
+            <wp:docPr descr="The three StorageClasses side by side: csi-hostpath-sc allows expansion, csi-hostpath-noexpand forbids it, and kind's default standard has no value at all" title="" id="32" name="Picture"/>
+            <a:graphic>
+              <a:graphicData uri="http://schemas.openxmlformats.org/drawingml/2006/picture">
+                <pic:pic>
+                  <pic:nvPicPr>
+                    <pic:cNvPr descr="../artifacts/lab-11/screenshots/05-storageclass-expansion.png" id="33" name="Picture"/>
+                    <pic:cNvPicPr>
+                      <a:picLocks noChangeArrowheads="1" noChangeAspect="1"/>
+                    </pic:cNvPicPr>
+                  </pic:nvPicPr>
+                  <pic:blipFill>
+                    <a:blip r:embed="rId31"/>
+                    <a:stretch>
+                      <a:fillRect/>
+                    </a:stretch>
+                  </pic:blipFill>
+                  <pic:spPr bwMode="auto">
+                    <a:xfrm>
+                      <a:off x="0" y="0"/>
+                      <a:ext cx="5943600" cy="694320"/>
+                    </a:xfrm>
+                    <a:prstGeom prst="rect">
+                      <a:avLst/>
+                    </a:prstGeom>
+                    <a:noFill/>
+                    <a:ln w="9525">
+                      <a:noFill/>
+                      <a:headEnd/>
+                      <a:tailEnd/>
+                    </a:ln>
+                  </pic:spPr>
+                </pic:pic>
+              </a:graphicData>
+            </a:graphic>
+          </wp:inline>
+        </w:drawing>
       </w:r>
     </w:p>
     <w:p>
@@ -4613,7 +4669,7 @@
         <w:rPr>
           <w:rStyle w:val="VerbatimChar"/>
         </w:rPr>
-        <w:t xml:space="preserve">csi-762d7c3ab1a1e8c5f370b4742ce4f947...      hostpath.csi.k8s.io   csistate-worker2   true</w:t>
+        <w:t xml:space="preserve">csi-762d7c3ab1a1e8c5f370b4742ce4f947...      hostpath.csi.k8s.io   csistate-worker   true</w:t>
       </w:r>
     </w:p>
     <w:p>
@@ -4624,7 +4680,7 @@
       </w:r>
     </w:p>
     <w:bookmarkEnd w:id="35"/>
-    <w:bookmarkStart w:id="36" w:name="X90d66412ba714498840561ec48bea3e6a424846"/>
+    <w:bookmarkStart w:id="45" w:name="X90d66412ba714498840561ec48bea3e6a424846"/>
     <w:p>
       <w:pPr>
         <w:pStyle w:val="Heading2"/>
@@ -5170,6 +5226,53 @@
         <w:pStyle w:val="BodyText"/>
       </w:pPr>
       <w:r>
+        <w:drawing>
+          <wp:inline>
+            <wp:extent cx="5943600" cy="1747958"/>
+            <wp:effectExtent b="0" l="0" r="0" t="0"/>
+            <wp:docPr descr="Phase one: the PVC requests 3Gi but reports 1Gi with Resizing and FileSystemResizePending both True, while the PV has already grown to 3Gi — and the events name volume_expand, then external-resizer, then FileSystemResizeRequired" title="" id="37" name="Picture"/>
+            <a:graphic>
+              <a:graphicData uri="http://schemas.openxmlformats.org/drawingml/2006/picture">
+                <pic:pic>
+                  <pic:nvPicPr>
+                    <pic:cNvPr descr="../artifacts/lab-11/screenshots/06-expansion-phase-1-controller.png" id="38" name="Picture"/>
+                    <pic:cNvPicPr>
+                      <a:picLocks noChangeArrowheads="1" noChangeAspect="1"/>
+                    </pic:cNvPicPr>
+                  </pic:nvPicPr>
+                  <pic:blipFill>
+                    <a:blip r:embed="rId36"/>
+                    <a:stretch>
+                      <a:fillRect/>
+                    </a:stretch>
+                  </pic:blipFill>
+                  <pic:spPr bwMode="auto">
+                    <a:xfrm>
+                      <a:off x="0" y="0"/>
+                      <a:ext cx="5943600" cy="1747958"/>
+                    </a:xfrm>
+                    <a:prstGeom prst="rect">
+                      <a:avLst/>
+                    </a:prstGeom>
+                    <a:noFill/>
+                    <a:ln w="9525">
+                      <a:noFill/>
+                      <a:headEnd/>
+                      <a:tailEnd/>
+                    </a:ln>
+                  </pic:spPr>
+                </pic:pic>
+              </a:graphicData>
+            </a:graphic>
+          </wp:inline>
+        </w:drawing>
+      </w:r>
+    </w:p>
+    <w:p>
+      <w:pPr>
+        <w:pStyle w:val="BodyText"/>
+      </w:pPr>
+      <w:r>
         <w:rPr>
           <w:b/>
           <w:bCs/>
@@ -5444,6 +5547,53 @@
     </w:p>
     <w:p>
       <w:pPr>
+        <w:pStyle w:val="FirstParagraph"/>
+      </w:pPr>
+      <w:r>
+        <w:drawing>
+          <wp:inline>
+            <wp:extent cx="5943600" cy="856418"/>
+            <wp:effectExtent b="0" l="0" r="0" t="0"/>
+            <wp:docPr descr="Phase two: after the Pod restarts, status.capacity reaches 3Gi, the conditions clear, and the file written before the resize is still there" title="" id="40" name="Picture"/>
+            <a:graphic>
+              <a:graphicData uri="http://schemas.openxmlformats.org/drawingml/2006/picture">
+                <pic:pic>
+                  <pic:nvPicPr>
+                    <pic:cNvPr descr="../artifacts/lab-11/screenshots/07-expansion-phase-2-node.png" id="41" name="Picture"/>
+                    <pic:cNvPicPr>
+                      <a:picLocks noChangeArrowheads="1" noChangeAspect="1"/>
+                    </pic:cNvPicPr>
+                  </pic:nvPicPr>
+                  <pic:blipFill>
+                    <a:blip r:embed="rId39"/>
+                    <a:stretch>
+                      <a:fillRect/>
+                    </a:stretch>
+                  </pic:blipFill>
+                  <pic:spPr bwMode="auto">
+                    <a:xfrm>
+                      <a:off x="0" y="0"/>
+                      <a:ext cx="5943600" cy="856418"/>
+                    </a:xfrm>
+                    <a:prstGeom prst="rect">
+                      <a:avLst/>
+                    </a:prstGeom>
+                    <a:noFill/>
+                    <a:ln w="9525">
+                      <a:noFill/>
+                      <a:headEnd/>
+                      <a:tailEnd/>
+                    </a:ln>
+                  </pic:spPr>
+                </pic:pic>
+              </a:graphicData>
+            </a:graphic>
+          </wp:inline>
+        </w:drawing>
+      </w:r>
+    </w:p>
+    <w:p>
+      <w:pPr>
         <w:pStyle w:val="BlockText"/>
       </w:pPr>
       <w:r>
@@ -5936,6 +6086,53 @@
       </w:r>
       <w:r>
         <w:t xml:space="preserve">, decided at provisioning time. Pick the class correctly up front; retrofitting means migrating data.</w:t>
+      </w:r>
+    </w:p>
+    <w:p>
+      <w:pPr>
+        <w:pStyle w:val="BodyText"/>
+      </w:pPr>
+      <w:r>
+        <w:drawing>
+          <wp:inline>
+            <wp:extent cx="5943600" cy="856418"/>
+            <wp:effectExtent b="0" l="0" r="0" t="0"/>
+            <wp:docPr descr="Both refusals: shrinking is rejected as less than status.capacity, and expanding a claim on a class without allowVolumeExpansion is forbidden outright" title="" id="43" name="Picture"/>
+            <a:graphic>
+              <a:graphicData uri="http://schemas.openxmlformats.org/drawingml/2006/picture">
+                <pic:pic>
+                  <pic:nvPicPr>
+                    <pic:cNvPr descr="../artifacts/lab-11/screenshots/08-expansion-refusals.png" id="44" name="Picture"/>
+                    <pic:cNvPicPr>
+                      <a:picLocks noChangeArrowheads="1" noChangeAspect="1"/>
+                    </pic:cNvPicPr>
+                  </pic:nvPicPr>
+                  <pic:blipFill>
+                    <a:blip r:embed="rId42"/>
+                    <a:stretch>
+                      <a:fillRect/>
+                    </a:stretch>
+                  </pic:blipFill>
+                  <pic:spPr bwMode="auto">
+                    <a:xfrm>
+                      <a:off x="0" y="0"/>
+                      <a:ext cx="5943600" cy="856418"/>
+                    </a:xfrm>
+                    <a:prstGeom prst="rect">
+                      <a:avLst/>
+                    </a:prstGeom>
+                    <a:noFill/>
+                    <a:ln w="9525">
+                      <a:noFill/>
+                      <a:headEnd/>
+                      <a:tailEnd/>
+                    </a:ln>
+                  </pic:spPr>
+                </pic:pic>
+              </a:graphicData>
+            </a:graphic>
+          </wp:inline>
+        </w:drawing>
       </w:r>
     </w:p>
     <w:p>
@@ -5945,8 +6142,8 @@
         </w:pict>
       </w:r>
     </w:p>
-    <w:bookmarkEnd w:id="36"/>
-    <w:bookmarkStart w:id="37" w:name="step-6--diagnose-a-multi-attach-failure"/>
+    <w:bookmarkEnd w:id="45"/>
+    <w:bookmarkStart w:id="52" w:name="step-6--diagnose-a-multi-attach-failure"/>
     <w:p>
       <w:pPr>
         <w:pStyle w:val="Heading2"/>
@@ -6062,7 +6259,7 @@
         <w:rPr>
           <w:rStyle w:val="VerbatimChar"/>
         </w:rPr>
-        <w:t xml:space="preserve">shop-db-0   csistate-worker2</w:t>
+        <w:t xml:space="preserve">shop-db-0   csistate-worker</w:t>
       </w:r>
     </w:p>
     <w:p>
@@ -6154,7 +6351,7 @@
         <w:rPr>
           <w:rStyle w:val="StringTok"/>
         </w:rPr>
-        <w:t xml:space="preserve">  nodeName: csistate-worker          # &lt;- the OTHER worker, on purpose</w:t>
+        <w:t xml:space="preserve">  nodeName: csistate-worker2          # &lt;- the OTHER worker, on purpose</w:t>
       </w:r>
       <w:r>
         <w:br/>
@@ -6358,7 +6555,7 @@
         <w:rPr>
           <w:rStyle w:val="VerbatimChar"/>
         </w:rPr>
-        <w:t xml:space="preserve">csistate-worker2   true</w:t>
+        <w:t xml:space="preserve">csistate-worker   true</w:t>
       </w:r>
     </w:p>
     <w:p>
@@ -6461,22 +6658,22 @@
         <w:rPr>
           <w:rStyle w:val="VerbatimChar"/>
         </w:rPr>
+        <w:t xml:space="preserve">csistate-worker</w:t>
+      </w:r>
+      <w:r>
+        <w:t xml:space="preserve"> </w:t>
+      </w:r>
+      <w:r>
+        <w:t xml:space="preserve">and refuses to create a second one for</w:t>
+      </w:r>
+      <w:r>
+        <w:t xml:space="preserve"> </w:t>
+      </w:r>
+      <w:r>
+        <w:rPr>
+          <w:rStyle w:val="VerbatimChar"/>
+        </w:rPr>
         <w:t xml:space="preserve">csistate-worker2</w:t>
-      </w:r>
-      <w:r>
-        <w:t xml:space="preserve"> </w:t>
-      </w:r>
-      <w:r>
-        <w:t xml:space="preserve">and refuses to create a second one for</w:t>
-      </w:r>
-      <w:r>
-        <w:t xml:space="preserve"> </w:t>
-      </w:r>
-      <w:r>
-        <w:rPr>
-          <w:rStyle w:val="VerbatimChar"/>
-        </w:rPr>
-        <w:t xml:space="preserve">csistate-worker</w:t>
       </w:r>
       <w:r>
         <w:t xml:space="preserve">. Notice there is still exactly</w:t>
@@ -6522,6 +6719,53 @@
     </w:p>
     <w:p>
       <w:pPr>
+        <w:pStyle w:val="BodyText"/>
+      </w:pPr>
+      <w:r>
+        <w:drawing>
+          <wp:inline>
+            <wp:extent cx="5943600" cy="1423762"/>
+            <wp:effectExtent b="0" l="0" r="0" t="0"/>
+            <wp:docPr descr="The second Pod stuck in ContainerCreating with FailedAttachVolume from the attachdetach-controller, and still only one VolumeAttachment, on the original node" title="" id="47" name="Picture"/>
+            <a:graphic>
+              <a:graphicData uri="http://schemas.openxmlformats.org/drawingml/2006/picture">
+                <pic:pic>
+                  <pic:nvPicPr>
+                    <pic:cNvPr descr="../artifacts/lab-11/screenshots/09-multi-attach-conflict.png" id="48" name="Picture"/>
+                    <pic:cNvPicPr>
+                      <a:picLocks noChangeArrowheads="1" noChangeAspect="1"/>
+                    </pic:cNvPicPr>
+                  </pic:nvPicPr>
+                  <pic:blipFill>
+                    <a:blip r:embed="rId46"/>
+                    <a:stretch>
+                      <a:fillRect/>
+                    </a:stretch>
+                  </pic:blipFill>
+                  <pic:spPr bwMode="auto">
+                    <a:xfrm>
+                      <a:off x="0" y="0"/>
+                      <a:ext cx="5943600" cy="1423762"/>
+                    </a:xfrm>
+                    <a:prstGeom prst="rect">
+                      <a:avLst/>
+                    </a:prstGeom>
+                    <a:noFill/>
+                    <a:ln w="9525">
+                      <a:noFill/>
+                      <a:headEnd/>
+                      <a:tailEnd/>
+                    </a:ln>
+                  </pic:spPr>
+                </pic:pic>
+              </a:graphicData>
+            </a:graphic>
+          </wp:inline>
+        </w:drawing>
+      </w:r>
+    </w:p>
+    <w:p>
+      <w:pPr>
         <w:pStyle w:val="BlockText"/>
       </w:pPr>
       <w:r>
@@ -6812,7 +7056,7 @@
         <w:rPr>
           <w:rStyle w:val="VerbatimChar"/>
         </w:rPr>
-        <w:t xml:space="preserve">csistate-worker   true</w:t>
+        <w:t xml:space="preserve">csistate-worker2   true</w:t>
       </w:r>
     </w:p>
     <w:p>
@@ -6924,7 +7168,7 @@
         <w:rPr>
           <w:rStyle w:val="VerbatimChar"/>
         </w:rPr>
-        <w:t xml:space="preserve"> "operator":"In","values":["csistate-worker2"]}]}]}}</w:t>
+        <w:t xml:space="preserve"> "operator":"In","values":["csistate-worker"]}]}]}}</w:t>
       </w:r>
       <w:r>
         <w:br/>
@@ -6963,16 +7207,16 @@
         <w:rPr>
           <w:rStyle w:val="VerbatimChar"/>
         </w:rPr>
-        <w:t xml:space="preserve">csistate-worker          &lt;none&gt;                &lt;none&gt;</w:t>
-      </w:r>
-      <w:r>
-        <w:br/>
-      </w:r>
-      <w:r>
-        <w:rPr>
-          <w:rStyle w:val="VerbatimChar"/>
-        </w:rPr>
-        <w:t xml:space="preserve">csistate-worker2         hostpath.csi.k8s.io   [topology.hostpath.csi/node]</w:t>
+        <w:t xml:space="preserve">csistate-worker2          &lt;none&gt;                &lt;none&gt;</w:t>
+      </w:r>
+      <w:r>
+        <w:br/>
+      </w:r>
+      <w:r>
+        <w:rPr>
+          <w:rStyle w:val="VerbatimChar"/>
+        </w:rPr>
+        <w:t xml:space="preserve">csistate-worker         hostpath.csi.k8s.io   [topology.hostpath.csi/node]</w:t>
       </w:r>
     </w:p>
     <w:p>
@@ -7005,7 +7249,7 @@
           <w:b/>
           <w:bCs/>
         </w:rPr>
-        <w:t xml:space="preserve">csistate-worker2</w:t>
+        <w:t xml:space="preserve">csistate-worker</w:t>
       </w:r>
       <w:r>
         <w:t xml:space="preserve">, so the provisioner wrote</w:t>
@@ -7023,7 +7267,22 @@
         <w:t xml:space="preserve"> </w:t>
       </w:r>
       <w:r>
-        <w:t xml:space="preserve">into the PV.</w:t>
+        <w:t xml:space="preserve">into the PV. (Which worker ends up running the single driver replica is arbitrary — read it from</w:t>
+      </w:r>
+      <w:r>
+        <w:t xml:space="preserve"> </w:t>
+      </w:r>
+      <w:r>
+        <w:rPr>
+          <w:rStyle w:val="VerbatimChar"/>
+        </w:rPr>
+        <w:t xml:space="preserve">CSINode</w:t>
+      </w:r>
+      <w:r>
+        <w:t xml:space="preserve"> </w:t>
+      </w:r>
+      <w:r>
+        <w:t xml:space="preserve">rather than assuming, and swap the names below accordingly.)</w:t>
       </w:r>
       <w:r>
         <w:t xml:space="preserve"> </w:t>
@@ -7064,7 +7323,7 @@
         <w:rPr>
           <w:rStyle w:val="CommentTok"/>
         </w:rPr>
-        <w:t xml:space="preserve"># re-create with nodeName: csistate-worker2</w:t>
+        <w:t xml:space="preserve"># re-create with nodeName: csistate-worker</w:t>
       </w:r>
       <w:r>
         <w:br/>
@@ -7228,6 +7487,53 @@
       </w:r>
       <w:r>
         <w:t xml:space="preserve">is never fixed by waiting; the Pod must move.</w:t>
+      </w:r>
+    </w:p>
+    <w:p>
+      <w:pPr>
+        <w:pStyle w:val="BodyText"/>
+      </w:pPr>
+      <w:r>
+        <w:drawing>
+          <wp:inline>
+            <wp:extent cx="5943600" cy="1585860"/>
+            <wp:effectExtent b="0" l="0" r="0" t="0"/>
+            <wp:docPr descr="Once the volume detaches the attach succeeds, and kubelet then refuses the mount with a NodeAffinity check failure — the PV is pinned by topology.hostpath.csi/node to the one node that runs the driver" title="" id="50" name="Picture"/>
+            <a:graphic>
+              <a:graphicData uri="http://schemas.openxmlformats.org/drawingml/2006/picture">
+                <pic:pic>
+                  <pic:nvPicPr>
+                    <pic:cNvPr descr="../artifacts/lab-11/screenshots/10-node-affinity-pinned-volume.png" id="51" name="Picture"/>
+                    <pic:cNvPicPr>
+                      <a:picLocks noChangeArrowheads="1" noChangeAspect="1"/>
+                    </pic:cNvPicPr>
+                  </pic:nvPicPr>
+                  <pic:blipFill>
+                    <a:blip r:embed="rId49"/>
+                    <a:stretch>
+                      <a:fillRect/>
+                    </a:stretch>
+                  </pic:blipFill>
+                  <pic:spPr bwMode="auto">
+                    <a:xfrm>
+                      <a:off x="0" y="0"/>
+                      <a:ext cx="5943600" cy="1585860"/>
+                    </a:xfrm>
+                    <a:prstGeom prst="rect">
+                      <a:avLst/>
+                    </a:prstGeom>
+                    <a:noFill/>
+                    <a:ln w="9525">
+                      <a:noFill/>
+                      <a:headEnd/>
+                      <a:tailEnd/>
+                    </a:ln>
+                  </pic:spPr>
+                </pic:pic>
+              </a:graphicData>
+            </a:graphic>
+          </wp:inline>
+        </w:drawing>
       </w:r>
     </w:p>
     <w:p>
@@ -7354,8 +7660,8 @@
         </w:pict>
       </w:r>
     </w:p>
-    <w:bookmarkEnd w:id="37"/>
-    <w:bookmarkStart w:id="38" w:name="Xf5af6d33e3ffc2fe594a31ed4ba4a276cbea622"/>
+    <w:bookmarkEnd w:id="52"/>
+    <w:bookmarkStart w:id="59" w:name="Xf5af6d33e3ffc2fe594a31ed4ba4a276cbea622"/>
     <w:p>
       <w:pPr>
         <w:pStyle w:val="Heading2"/>
@@ -7768,6 +8074,53 @@
     </w:p>
     <w:p>
       <w:pPr>
+        <w:pStyle w:val="BodyText"/>
+      </w:pPr>
+      <w:r>
+        <w:drawing>
+          <wp:inline>
+            <wp:extent cx="5943600" cy="1099566"/>
+            <wp:effectExtent b="0" l="0" r="0" t="0"/>
+            <wp:docPr descr="The deleted PVC sitting in Terminating with a deletionTimestamp and the kubernetes.io/pvc-protection finalizer, while the volume still serves reads" title="" id="54" name="Picture"/>
+            <a:graphic>
+              <a:graphicData uri="http://schemas.openxmlformats.org/drawingml/2006/picture">
+                <pic:pic>
+                  <pic:nvPicPr>
+                    <pic:cNvPr descr="../artifacts/lab-11/screenshots/11-pvc-finalizer-holds-deletion.png" id="55" name="Picture"/>
+                    <pic:cNvPicPr>
+                      <a:picLocks noChangeArrowheads="1" noChangeAspect="1"/>
+                    </pic:cNvPicPr>
+                  </pic:nvPicPr>
+                  <pic:blipFill>
+                    <a:blip r:embed="rId53"/>
+                    <a:stretch>
+                      <a:fillRect/>
+                    </a:stretch>
+                  </pic:blipFill>
+                  <pic:spPr bwMode="auto">
+                    <a:xfrm>
+                      <a:off x="0" y="0"/>
+                      <a:ext cx="5943600" cy="1099566"/>
+                    </a:xfrm>
+                    <a:prstGeom prst="rect">
+                      <a:avLst/>
+                    </a:prstGeom>
+                    <a:noFill/>
+                    <a:ln w="9525">
+                      <a:noFill/>
+                      <a:headEnd/>
+                      <a:tailEnd/>
+                    </a:ln>
+                  </pic:spPr>
+                </pic:pic>
+              </a:graphicData>
+            </a:graphic>
+          </wp:inline>
+        </w:drawing>
+      </w:r>
+    </w:p>
+    <w:p>
+      <w:pPr>
         <w:pStyle w:val="BlockText"/>
       </w:pPr>
       <w:r>
@@ -8946,6 +9299,53 @@
       </w:r>
       <w:r>
         <w:t xml:space="preserve">.</w:t>
+      </w:r>
+    </w:p>
+    <w:p>
+      <w:pPr>
+        <w:pStyle w:val="BodyText"/>
+      </w:pPr>
+      <w:r>
+        <w:drawing>
+          <wp:inline>
+            <wp:extent cx="5943600" cy="1423762"/>
+            <wp:effectExtent b="0" l="0" r="0" t="0"/>
+            <wp:docPr descr="The clone bound alongside its source, carrying the source's data, then diverging when written to while the source stays unchanged" title="" id="57" name="Picture"/>
+            <a:graphic>
+              <a:graphicData uri="http://schemas.openxmlformats.org/drawingml/2006/picture">
+                <pic:pic>
+                  <pic:nvPicPr>
+                    <pic:cNvPr descr="../artifacts/lab-11/screenshots/12-volume-clone.png" id="58" name="Picture"/>
+                    <pic:cNvPicPr>
+                      <a:picLocks noChangeArrowheads="1" noChangeAspect="1"/>
+                    </pic:cNvPicPr>
+                  </pic:nvPicPr>
+                  <pic:blipFill>
+                    <a:blip r:embed="rId56"/>
+                    <a:stretch>
+                      <a:fillRect/>
+                    </a:stretch>
+                  </pic:blipFill>
+                  <pic:spPr bwMode="auto">
+                    <a:xfrm>
+                      <a:off x="0" y="0"/>
+                      <a:ext cx="5943600" cy="1423762"/>
+                    </a:xfrm>
+                    <a:prstGeom prst="rect">
+                      <a:avLst/>
+                    </a:prstGeom>
+                    <a:noFill/>
+                    <a:ln w="9525">
+                      <a:noFill/>
+                      <a:headEnd/>
+                      <a:tailEnd/>
+                    </a:ln>
+                  </pic:spPr>
+                </pic:pic>
+              </a:graphicData>
+            </a:graphic>
+          </wp:inline>
+        </w:drawing>
       </w:r>
     </w:p>
     <w:p>
@@ -8955,8 +9355,8 @@
         </w:pict>
       </w:r>
     </w:p>
-    <w:bookmarkEnd w:id="38"/>
-    <w:bookmarkStart w:id="39" w:name="step-8--clean-up"/>
+    <w:bookmarkEnd w:id="59"/>
+    <w:bookmarkStart w:id="60" w:name="step-8--clean-up"/>
     <w:p>
       <w:pPr>
         <w:pStyle w:val="Heading2"/>
@@ -9106,8 +9506,8 @@
         </w:pict>
       </w:r>
     </w:p>
-    <w:bookmarkEnd w:id="39"/>
-    <w:bookmarkStart w:id="40" w:name="what-you-learned"/>
+    <w:bookmarkEnd w:id="60"/>
+    <w:bookmarkStart w:id="61" w:name="what-you-learned"/>
     <w:p>
       <w:pPr>
         <w:pStyle w:val="Heading2"/>
@@ -9920,8 +10320,8 @@
         </w:tc>
       </w:tr>
     </w:tbl>
-    <w:bookmarkEnd w:id="40"/>
-    <w:bookmarkStart w:id="43" w:name="evidence"/>
+    <w:bookmarkEnd w:id="61"/>
+    <w:bookmarkStart w:id="64" w:name="evidence"/>
     <w:p>
       <w:pPr>
         <w:pStyle w:val="Heading2"/>
@@ -9940,7 +10340,7 @@
       <w:r>
         <w:t xml:space="preserve"> </w:t>
       </w:r>
-      <w:hyperlink r:id="rId41">
+      <w:hyperlink r:id="rId62">
         <w:r>
           <w:rPr>
             <w:rStyle w:val="VerbatimChar"/>
@@ -9957,7 +10357,7 @@
       <w:r>
         <w:t xml:space="preserve"> </w:t>
       </w:r>
-      <w:hyperlink r:id="rId42">
+      <w:hyperlink r:id="rId63">
         <w:r>
           <w:rPr>
             <w:rStyle w:val="VerbatimChar"/>
@@ -10017,7 +10417,7 @@
       <w:r>
         <w:t xml:space="preserve"> </w:t>
       </w:r>
-      <w:hyperlink r:id="rId32">
+      <w:hyperlink r:id="rId29">
         <w:r>
           <w:rPr>
             <w:rStyle w:val="Hyperlink"/>
@@ -10026,7 +10426,7 @@
         </w:r>
       </w:hyperlink>
     </w:p>
-    <w:bookmarkEnd w:id="43"/>
+    <w:bookmarkEnd w:id="64"/>
     <w:sectPr>
       <w:pgSz w:h="15840" w:w="12240"/>
       <w:pgMar w:bottom="1440" w:footer="720" w:gutter="0" w:header="720" w:left="1440" w:right="1440" w:top="1440"/>

</xml_diff>

<commit_message>
Rebuild lab 11 docx with its mermaid diagram
Co-Authored-By: Claude Opus 5 <noreply@anthropic.com>
</commit_message>
<xml_diff>
--- a/day-2-stateful-storage-and-exposure/lab-11-statefulsets-snapshots.docx
+++ b/day-2-stateful-storage-and-exposure/lab-11-statefulsets-snapshots.docx
@@ -1086,7 +1086,7 @@
       </w:r>
     </w:p>
     <w:bookmarkEnd w:id="12"/>
-    <w:bookmarkStart w:id="13" w:name="the-idea-in-60-seconds"/>
+    <w:bookmarkStart w:id="16" w:name="the-idea-in-60-seconds"/>
     <w:p>
       <w:pPr>
         <w:pStyle w:val="Heading2"/>
@@ -1252,566 +1252,557 @@
     </w:p>
     <w:p>
       <w:pPr>
-        <w:pStyle w:val="SourceCode"/>
-      </w:pPr>
-      <w:r>
-        <w:rPr>
-          <w:rStyle w:val="VerbatimChar"/>
-        </w:rPr>
-        <w:t xml:space="preserve">flowchart TB</w:t>
-      </w:r>
-      <w:r>
-        <w:br/>
-      </w:r>
-      <w:r>
-        <w:rPr>
-          <w:rStyle w:val="VerbatimChar"/>
-        </w:rPr>
-        <w:t xml:space="preserve">    SS["StatefulSet db-0"] --&gt; PVC["PVC data-db-0&lt;br/&gt;(pd.csi, 1Gi)"]</w:t>
-      </w:r>
-      <w:r>
-        <w:br/>
-      </w:r>
-      <w:r>
-        <w:rPr>
-          <w:rStyle w:val="VerbatimChar"/>
-        </w:rPr>
-        <w:t xml:space="preserve">    PVC --&gt; PD["real Persistent Disk&lt;br/&gt;/data/message = important-data-v1"]</w:t>
-      </w:r>
-      <w:r>
-        <w:br/>
-      </w:r>
-      <w:r>
-        <w:rPr>
-          <w:rStyle w:val="VerbatimChar"/>
-        </w:rPr>
-        <w:t xml:space="preserve">    PD --&gt;|"VolumeSnapshot"| SNAP["snapshot db-snap&lt;br/&gt;readyToUse = true"]</w:t>
-      </w:r>
-      <w:r>
-        <w:br/>
-      </w:r>
-      <w:r>
-        <w:rPr>
-          <w:rStyle w:val="VerbatimChar"/>
-        </w:rPr>
-        <w:t xml:space="preserve">    PVC -.-&gt;|"delete StatefulSet + PVC"| GONE["volume gone"]</w:t>
-      </w:r>
-      <w:r>
-        <w:br/>
-      </w:r>
-      <w:r>
-        <w:rPr>
-          <w:rStyle w:val="VerbatimChar"/>
-        </w:rPr>
-        <w:t xml:space="preserve">    SNAP --&gt;|"dataSource on a new PVC"| RESTORE["PVC data-restored&lt;br/&gt;/data/message intact"]</w:t>
-      </w:r>
-    </w:p>
-    <w:p>
-      <w:r>
-        <w:pict>
-          <v:rect style="width:0;height:1.5pt" o:hralign="center" o:hrstd="t" o:hr="t"/>
-        </w:pict>
-      </w:r>
-    </w:p>
-    <w:bookmarkEnd w:id="13"/>
-    <w:bookmarkStart w:id="17" w:name="Xffb589b54b5dab2775ec104f4bebac2679053b5"/>
-    <w:p>
-      <w:pPr>
-        <w:pStyle w:val="Heading2"/>
-      </w:pPr>
-      <w:r>
-        <w:t xml:space="preserve">Step 1 — Run a StatefulSet and write data to its volume</w:t>
-      </w:r>
-    </w:p>
-    <w:p>
-      <w:pPr>
-        <w:pStyle w:val="FirstParagraph"/>
-      </w:pPr>
-      <w:r>
-        <w:rPr>
-          <w:b/>
-          <w:bCs/>
-        </w:rPr>
-        <w:t xml:space="preserve">Goal:</w:t>
-      </w:r>
-      <w:r>
-        <w:t xml:space="preserve"> </w:t>
-      </w:r>
-      <w:r>
-        <w:t xml:space="preserve">create a StatefulSet whose Pod has its own persistent disk, and put a known value on it.</w:t>
-      </w:r>
-    </w:p>
-    <w:p>
-      <w:pPr>
-        <w:pStyle w:val="BodyText"/>
-      </w:pPr>
-      <w:r>
-        <w:rPr>
-          <w:b/>
-          <w:bCs/>
-        </w:rPr>
-        <w:t xml:space="preserve">1. Create the StatefulSet (it declares a</w:t>
-      </w:r>
-      <w:r>
-        <w:rPr>
-          <w:b/>
-          <w:bCs/>
-        </w:rPr>
-        <w:t xml:space="preserve"> </w:t>
-      </w:r>
-      <w:r>
-        <w:rPr>
-          <w:rStyle w:val="VerbatimChar"/>
-          <w:b/>
-          <w:bCs/>
-        </w:rPr>
-        <w:t xml:space="preserve">volumeClaimTemplate</w:t>
-      </w:r>
-      <w:r>
-        <w:rPr>
-          <w:b/>
-          <w:bCs/>
-        </w:rPr>
-        <w:t xml:space="preserve">), wait for it, then write a file:</w:t>
-      </w:r>
-    </w:p>
-    <w:p>
-      <w:pPr>
-        <w:pStyle w:val="SourceCode"/>
-      </w:pPr>
-      <w:r>
-        <w:rPr>
-          <w:rStyle w:val="ExtensionTok"/>
-        </w:rPr>
-        <w:t xml:space="preserve">kubectl</w:t>
-      </w:r>
-      <w:r>
-        <w:rPr>
-          <w:rStyle w:val="NormalTok"/>
-        </w:rPr>
-        <w:t xml:space="preserve"> apply </w:t>
-      </w:r>
-      <w:r>
-        <w:rPr>
-          <w:rStyle w:val="AttributeTok"/>
-        </w:rPr>
-        <w:t xml:space="preserve">-f</w:t>
-      </w:r>
-      <w:r>
-        <w:rPr>
-          <w:rStyle w:val="NormalTok"/>
-        </w:rPr>
-        <w:t xml:space="preserve"> </w:t>
-      </w:r>
-      <w:r>
-        <w:rPr>
-          <w:rStyle w:val="AttributeTok"/>
-        </w:rPr>
-        <w:t xml:space="preserve">-</w:t>
-      </w:r>
-      <w:r>
-        <w:rPr>
-          <w:rStyle w:val="NormalTok"/>
-        </w:rPr>
-        <w:t xml:space="preserve"> </w:t>
-      </w:r>
-      <w:r>
-        <w:rPr>
-          <w:rStyle w:val="OperatorTok"/>
-        </w:rPr>
-        <w:t xml:space="preserve">&lt;&lt;'EOF'</w:t>
-      </w:r>
-      <w:r>
-        <w:br/>
-      </w:r>
-      <w:r>
-        <w:rPr>
-          <w:rStyle w:val="StringTok"/>
-        </w:rPr>
-        <w:t xml:space="preserve">apiVersion: apps/v1</w:t>
-      </w:r>
-      <w:r>
-        <w:br/>
-      </w:r>
-      <w:r>
-        <w:rPr>
-          <w:rStyle w:val="StringTok"/>
-        </w:rPr>
-        <w:t xml:space="preserve">kind: StatefulSet</w:t>
-      </w:r>
-      <w:r>
-        <w:br/>
-      </w:r>
-      <w:r>
-        <w:rPr>
-          <w:rStyle w:val="StringTok"/>
-        </w:rPr>
-        <w:t xml:space="preserve">metadata: {name: db}</w:t>
-      </w:r>
-      <w:r>
-        <w:br/>
-      </w:r>
-      <w:r>
-        <w:rPr>
-          <w:rStyle w:val="StringTok"/>
-        </w:rPr>
-        <w:t xml:space="preserve">spec:</w:t>
-      </w:r>
-      <w:r>
-        <w:br/>
-      </w:r>
-      <w:r>
-        <w:rPr>
-          <w:rStyle w:val="StringTok"/>
-        </w:rPr>
-        <w:t xml:space="preserve">  serviceName: db</w:t>
-      </w:r>
-      <w:r>
-        <w:br/>
-      </w:r>
-      <w:r>
-        <w:rPr>
-          <w:rStyle w:val="StringTok"/>
-        </w:rPr>
-        <w:t xml:space="preserve">  replicas: 1</w:t>
-      </w:r>
-      <w:r>
-        <w:br/>
-      </w:r>
-      <w:r>
-        <w:rPr>
-          <w:rStyle w:val="StringTok"/>
-        </w:rPr>
-        <w:t xml:space="preserve">  selector: {matchLabels: {app: db}}</w:t>
-      </w:r>
-      <w:r>
-        <w:br/>
-      </w:r>
-      <w:r>
-        <w:rPr>
-          <w:rStyle w:val="StringTok"/>
-        </w:rPr>
-        <w:t xml:space="preserve">  template:</w:t>
-      </w:r>
-      <w:r>
-        <w:br/>
-      </w:r>
-      <w:r>
-        <w:rPr>
-          <w:rStyle w:val="StringTok"/>
-        </w:rPr>
-        <w:t xml:space="preserve">    metadata: {labels: {app: db}}</w:t>
-      </w:r>
-      <w:r>
-        <w:br/>
-      </w:r>
-      <w:r>
-        <w:rPr>
-          <w:rStyle w:val="StringTok"/>
-        </w:rPr>
-        <w:t xml:space="preserve">    spec:</w:t>
-      </w:r>
-      <w:r>
-        <w:br/>
-      </w:r>
-      <w:r>
-        <w:rPr>
-          <w:rStyle w:val="StringTok"/>
-        </w:rPr>
-        <w:t xml:space="preserve">      containers:</w:t>
-      </w:r>
-      <w:r>
-        <w:br/>
-      </w:r>
-      <w:r>
-        <w:rPr>
-          <w:rStyle w:val="StringTok"/>
-        </w:rPr>
-        <w:t xml:space="preserve">        - name: app</w:t>
-      </w:r>
-      <w:r>
-        <w:br/>
-      </w:r>
-      <w:r>
-        <w:rPr>
-          <w:rStyle w:val="StringTok"/>
-        </w:rPr>
-        <w:t xml:space="preserve">          image: busybox:1.36</w:t>
-      </w:r>
-      <w:r>
-        <w:br/>
-      </w:r>
-      <w:r>
-        <w:rPr>
-          <w:rStyle w:val="StringTok"/>
-        </w:rPr>
-        <w:t xml:space="preserve">          command: ["sh","-c","sleep 3600"]</w:t>
-      </w:r>
-      <w:r>
-        <w:br/>
-      </w:r>
-      <w:r>
-        <w:rPr>
-          <w:rStyle w:val="StringTok"/>
-        </w:rPr>
-        <w:t xml:space="preserve">          volumeMounts: [{name: data, mountPath: /data}]</w:t>
-      </w:r>
-      <w:r>
-        <w:br/>
-      </w:r>
-      <w:r>
-        <w:rPr>
-          <w:rStyle w:val="StringTok"/>
-        </w:rPr>
-        <w:t xml:space="preserve">  volumeClaimTemplates:</w:t>
-      </w:r>
-      <w:r>
-        <w:br/>
-      </w:r>
-      <w:r>
-        <w:rPr>
-          <w:rStyle w:val="StringTok"/>
-        </w:rPr>
-        <w:t xml:space="preserve">    - metadata: {name: data}</w:t>
-      </w:r>
-      <w:r>
-        <w:br/>
-      </w:r>
-      <w:r>
-        <w:rPr>
-          <w:rStyle w:val="StringTok"/>
-        </w:rPr>
-        <w:t xml:space="preserve">      spec:</w:t>
-      </w:r>
-      <w:r>
-        <w:br/>
-      </w:r>
-      <w:r>
-        <w:rPr>
-          <w:rStyle w:val="StringTok"/>
-        </w:rPr>
-        <w:t xml:space="preserve">        accessModes: ["ReadWriteOnce"]</w:t>
-      </w:r>
-      <w:r>
-        <w:br/>
-      </w:r>
-      <w:r>
-        <w:rPr>
-          <w:rStyle w:val="StringTok"/>
-        </w:rPr>
-        <w:t xml:space="preserve">        storageClassName: standard-rwo</w:t>
-      </w:r>
-      <w:r>
-        <w:br/>
-      </w:r>
-      <w:r>
-        <w:rPr>
-          <w:rStyle w:val="StringTok"/>
-        </w:rPr>
-        <w:t xml:space="preserve">        resources: {requests: {storage: 1Gi}}</w:t>
-      </w:r>
-      <w:r>
-        <w:br/>
-      </w:r>
-      <w:r>
-        <w:rPr>
-          <w:rStyle w:val="OperatorTok"/>
-        </w:rPr>
-        <w:t xml:space="preserve">EOF</w:t>
-      </w:r>
-      <w:r>
-        <w:br/>
-      </w:r>
-      <w:r>
-        <w:rPr>
-          <w:rStyle w:val="ExtensionTok"/>
-        </w:rPr>
-        <w:t xml:space="preserve">kubectl</w:t>
-      </w:r>
-      <w:r>
-        <w:rPr>
-          <w:rStyle w:val="NormalTok"/>
-        </w:rPr>
-        <w:t xml:space="preserve"> rollout status statefulset/db </w:t>
-      </w:r>
-      <w:r>
-        <w:rPr>
-          <w:rStyle w:val="AttributeTok"/>
-        </w:rPr>
-        <w:t xml:space="preserve">--timeout</w:t>
-      </w:r>
-      <w:r>
-        <w:rPr>
-          <w:rStyle w:val="OperatorTok"/>
-        </w:rPr>
-        <w:t xml:space="preserve">=</w:t>
-      </w:r>
-      <w:r>
-        <w:rPr>
-          <w:rStyle w:val="NormalTok"/>
-        </w:rPr>
-        <w:t xml:space="preserve">120s</w:t>
-      </w:r>
-      <w:r>
-        <w:br/>
-      </w:r>
-      <w:r>
-        <w:br/>
-      </w:r>
-      <w:r>
-        <w:rPr>
-          <w:rStyle w:val="ExtensionTok"/>
-        </w:rPr>
-        <w:t xml:space="preserve">kubectl</w:t>
-      </w:r>
-      <w:r>
-        <w:rPr>
-          <w:rStyle w:val="NormalTok"/>
-        </w:rPr>
-        <w:t xml:space="preserve"> exec db-0 </w:t>
-      </w:r>
-      <w:r>
-        <w:rPr>
-          <w:rStyle w:val="AttributeTok"/>
-        </w:rPr>
-        <w:t xml:space="preserve">--</w:t>
-      </w:r>
-      <w:r>
-        <w:rPr>
-          <w:rStyle w:val="NormalTok"/>
-        </w:rPr>
-        <w:t xml:space="preserve"> sh </w:t>
-      </w:r>
-      <w:r>
-        <w:rPr>
-          <w:rStyle w:val="AttributeTok"/>
-        </w:rPr>
-        <w:t xml:space="preserve">-c</w:t>
-      </w:r>
-      <w:r>
-        <w:rPr>
-          <w:rStyle w:val="NormalTok"/>
-        </w:rPr>
-        <w:t xml:space="preserve"> </w:t>
-      </w:r>
-      <w:r>
-        <w:rPr>
-          <w:rStyle w:val="StringTok"/>
-        </w:rPr>
-        <w:t xml:space="preserve">'echo "important-data-v1" &gt; /data/message; cat /data/message'</w:t>
-      </w:r>
-      <w:r>
-        <w:br/>
-      </w:r>
-      <w:r>
-        <w:rPr>
-          <w:rStyle w:val="ExtensionTok"/>
-        </w:rPr>
-        <w:t xml:space="preserve">kubectl</w:t>
-      </w:r>
-      <w:r>
-        <w:rPr>
-          <w:rStyle w:val="NormalTok"/>
-        </w:rPr>
-        <w:t xml:space="preserve"> get pvc data-db-0</w:t>
-      </w:r>
-    </w:p>
-    <w:p>
-      <w:pPr>
-        <w:pStyle w:val="FirstParagraph"/>
-      </w:pPr>
-      <w:r>
-        <w:rPr>
-          <w:b/>
-          <w:bCs/>
-        </w:rPr>
-        <w:t xml:space="preserve">What you should see:</w:t>
-      </w:r>
-      <w:r>
-        <w:t xml:space="preserve"> </w:t>
-      </w:r>
-      <w:r>
-        <w:t xml:space="preserve">the rollout completes,</w:t>
-      </w:r>
-      <w:r>
-        <w:t xml:space="preserve"> </w:t>
-      </w:r>
-      <w:r>
-        <w:rPr>
-          <w:rStyle w:val="VerbatimChar"/>
-        </w:rPr>
-        <w:t xml:space="preserve">cat /data/message</w:t>
-      </w:r>
-      <w:r>
-        <w:t xml:space="preserve"> </w:t>
-      </w:r>
-      <w:r>
-        <w:t xml:space="preserve">prints</w:t>
-      </w:r>
-      <w:r>
-        <w:t xml:space="preserve"> </w:t>
-      </w:r>
-      <w:r>
-        <w:rPr>
-          <w:rStyle w:val="VerbatimChar"/>
-        </w:rPr>
-        <w:t xml:space="preserve">important-data-v1</w:t>
-      </w:r>
-      <w:r>
-        <w:t xml:space="preserve">, and</w:t>
-      </w:r>
-      <w:r>
-        <w:t xml:space="preserve"> </w:t>
-      </w:r>
-      <w:r>
-        <w:rPr>
-          <w:rStyle w:val="VerbatimChar"/>
-        </w:rPr>
-        <w:t xml:space="preserve">kubectl get pvc data-db-0</w:t>
-      </w:r>
-      <w:r>
-        <w:t xml:space="preserve"> </w:t>
-      </w:r>
-      <w:r>
-        <w:t xml:space="preserve">shows a</w:t>
-      </w:r>
-      <w:r>
-        <w:t xml:space="preserve"> </w:t>
-      </w:r>
-      <w:r>
-        <w:rPr>
-          <w:rStyle w:val="VerbatimChar"/>
-        </w:rPr>
-        <w:t xml:space="preserve">Bound</w:t>
-      </w:r>
-      <w:r>
-        <w:t xml:space="preserve"> </w:t>
-      </w:r>
-      <w:r>
-        <w:t xml:space="preserve">1Gi PVC.</w:t>
-      </w:r>
-    </w:p>
-    <w:p>
-      <w:pPr>
         <w:pStyle w:val="BodyText"/>
       </w:pPr>
       <w:r>
         <w:drawing>
           <wp:inline>
-            <wp:extent cx="5943600" cy="4116751"/>
+            <wp:extent cx="5943600" cy="8240819"/>
             <wp:effectExtent b="0" l="0" r="0" t="0"/>
-            <wp:docPr descr="StatefulSet running, data written, PVC bound" title="" id="15" name="Picture"/>
+            <wp:docPr descr="Architecture diagram" title="" id="14" name="Picture"/>
             <a:graphic>
               <a:graphicData uri="http://schemas.openxmlformats.org/drawingml/2006/picture">
                 <pic:pic>
                   <pic:nvPicPr>
-                    <pic:cNvPr descr="../artifacts/lab-11/screenshots/01-statefulset-data.png" id="16" name="Picture"/>
+                    <pic:cNvPr descr="artifacts/lab-11/diagrams/diagram.png" id="15" name="Picture"/>
                     <pic:cNvPicPr>
                       <a:picLocks noChangeArrowheads="1" noChangeAspect="1"/>
                     </pic:cNvPicPr>
                   </pic:nvPicPr>
                   <pic:blipFill>
-                    <a:blip r:embed="rId14"/>
+                    <a:blip r:embed="rId13"/>
+                    <a:stretch>
+                      <a:fillRect/>
+                    </a:stretch>
+                  </pic:blipFill>
+                  <pic:spPr bwMode="auto">
+                    <a:xfrm>
+                      <a:off x="0" y="0"/>
+                      <a:ext cx="5943600" cy="8240819"/>
+                    </a:xfrm>
+                    <a:prstGeom prst="rect">
+                      <a:avLst/>
+                    </a:prstGeom>
+                    <a:noFill/>
+                    <a:ln w="9525">
+                      <a:noFill/>
+                      <a:headEnd/>
+                      <a:tailEnd/>
+                    </a:ln>
+                  </pic:spPr>
+                </pic:pic>
+              </a:graphicData>
+            </a:graphic>
+          </wp:inline>
+        </w:drawing>
+      </w:r>
+    </w:p>
+    <w:p>
+      <w:r>
+        <w:pict>
+          <v:rect style="width:0;height:1.5pt" o:hralign="center" o:hrstd="t" o:hr="t"/>
+        </w:pict>
+      </w:r>
+    </w:p>
+    <w:bookmarkEnd w:id="16"/>
+    <w:bookmarkStart w:id="20" w:name="Xffb589b54b5dab2775ec104f4bebac2679053b5"/>
+    <w:p>
+      <w:pPr>
+        <w:pStyle w:val="Heading2"/>
+      </w:pPr>
+      <w:r>
+        <w:t xml:space="preserve">Step 1 — Run a StatefulSet and write data to its volume</w:t>
+      </w:r>
+    </w:p>
+    <w:p>
+      <w:pPr>
+        <w:pStyle w:val="FirstParagraph"/>
+      </w:pPr>
+      <w:r>
+        <w:rPr>
+          <w:b/>
+          <w:bCs/>
+        </w:rPr>
+        <w:t xml:space="preserve">Goal:</w:t>
+      </w:r>
+      <w:r>
+        <w:t xml:space="preserve"> </w:t>
+      </w:r>
+      <w:r>
+        <w:t xml:space="preserve">create a StatefulSet whose Pod has its own persistent disk, and put a known value on it.</w:t>
+      </w:r>
+    </w:p>
+    <w:p>
+      <w:pPr>
+        <w:pStyle w:val="BodyText"/>
+      </w:pPr>
+      <w:r>
+        <w:rPr>
+          <w:b/>
+          <w:bCs/>
+        </w:rPr>
+        <w:t xml:space="preserve">1. Create the StatefulSet (it declares a</w:t>
+      </w:r>
+      <w:r>
+        <w:rPr>
+          <w:b/>
+          <w:bCs/>
+        </w:rPr>
+        <w:t xml:space="preserve"> </w:t>
+      </w:r>
+      <w:r>
+        <w:rPr>
+          <w:rStyle w:val="VerbatimChar"/>
+          <w:b/>
+          <w:bCs/>
+        </w:rPr>
+        <w:t xml:space="preserve">volumeClaimTemplate</w:t>
+      </w:r>
+      <w:r>
+        <w:rPr>
+          <w:b/>
+          <w:bCs/>
+        </w:rPr>
+        <w:t xml:space="preserve">), wait for it, then write a file:</w:t>
+      </w:r>
+    </w:p>
+    <w:p>
+      <w:pPr>
+        <w:pStyle w:val="SourceCode"/>
+      </w:pPr>
+      <w:r>
+        <w:rPr>
+          <w:rStyle w:val="ExtensionTok"/>
+        </w:rPr>
+        <w:t xml:space="preserve">kubectl</w:t>
+      </w:r>
+      <w:r>
+        <w:rPr>
+          <w:rStyle w:val="NormalTok"/>
+        </w:rPr>
+        <w:t xml:space="preserve"> apply </w:t>
+      </w:r>
+      <w:r>
+        <w:rPr>
+          <w:rStyle w:val="AttributeTok"/>
+        </w:rPr>
+        <w:t xml:space="preserve">-f</w:t>
+      </w:r>
+      <w:r>
+        <w:rPr>
+          <w:rStyle w:val="NormalTok"/>
+        </w:rPr>
+        <w:t xml:space="preserve"> </w:t>
+      </w:r>
+      <w:r>
+        <w:rPr>
+          <w:rStyle w:val="AttributeTok"/>
+        </w:rPr>
+        <w:t xml:space="preserve">-</w:t>
+      </w:r>
+      <w:r>
+        <w:rPr>
+          <w:rStyle w:val="NormalTok"/>
+        </w:rPr>
+        <w:t xml:space="preserve"> </w:t>
+      </w:r>
+      <w:r>
+        <w:rPr>
+          <w:rStyle w:val="OperatorTok"/>
+        </w:rPr>
+        <w:t xml:space="preserve">&lt;&lt;'EOF'</w:t>
+      </w:r>
+      <w:r>
+        <w:br/>
+      </w:r>
+      <w:r>
+        <w:rPr>
+          <w:rStyle w:val="StringTok"/>
+        </w:rPr>
+        <w:t xml:space="preserve">apiVersion: apps/v1</w:t>
+      </w:r>
+      <w:r>
+        <w:br/>
+      </w:r>
+      <w:r>
+        <w:rPr>
+          <w:rStyle w:val="StringTok"/>
+        </w:rPr>
+        <w:t xml:space="preserve">kind: StatefulSet</w:t>
+      </w:r>
+      <w:r>
+        <w:br/>
+      </w:r>
+      <w:r>
+        <w:rPr>
+          <w:rStyle w:val="StringTok"/>
+        </w:rPr>
+        <w:t xml:space="preserve">metadata: {name: db}</w:t>
+      </w:r>
+      <w:r>
+        <w:br/>
+      </w:r>
+      <w:r>
+        <w:rPr>
+          <w:rStyle w:val="StringTok"/>
+        </w:rPr>
+        <w:t xml:space="preserve">spec:</w:t>
+      </w:r>
+      <w:r>
+        <w:br/>
+      </w:r>
+      <w:r>
+        <w:rPr>
+          <w:rStyle w:val="StringTok"/>
+        </w:rPr>
+        <w:t xml:space="preserve">  serviceName: db</w:t>
+      </w:r>
+      <w:r>
+        <w:br/>
+      </w:r>
+      <w:r>
+        <w:rPr>
+          <w:rStyle w:val="StringTok"/>
+        </w:rPr>
+        <w:t xml:space="preserve">  replicas: 1</w:t>
+      </w:r>
+      <w:r>
+        <w:br/>
+      </w:r>
+      <w:r>
+        <w:rPr>
+          <w:rStyle w:val="StringTok"/>
+        </w:rPr>
+        <w:t xml:space="preserve">  selector: {matchLabels: {app: db}}</w:t>
+      </w:r>
+      <w:r>
+        <w:br/>
+      </w:r>
+      <w:r>
+        <w:rPr>
+          <w:rStyle w:val="StringTok"/>
+        </w:rPr>
+        <w:t xml:space="preserve">  template:</w:t>
+      </w:r>
+      <w:r>
+        <w:br/>
+      </w:r>
+      <w:r>
+        <w:rPr>
+          <w:rStyle w:val="StringTok"/>
+        </w:rPr>
+        <w:t xml:space="preserve">    metadata: {labels: {app: db}}</w:t>
+      </w:r>
+      <w:r>
+        <w:br/>
+      </w:r>
+      <w:r>
+        <w:rPr>
+          <w:rStyle w:val="StringTok"/>
+        </w:rPr>
+        <w:t xml:space="preserve">    spec:</w:t>
+      </w:r>
+      <w:r>
+        <w:br/>
+      </w:r>
+      <w:r>
+        <w:rPr>
+          <w:rStyle w:val="StringTok"/>
+        </w:rPr>
+        <w:t xml:space="preserve">      containers:</w:t>
+      </w:r>
+      <w:r>
+        <w:br/>
+      </w:r>
+      <w:r>
+        <w:rPr>
+          <w:rStyle w:val="StringTok"/>
+        </w:rPr>
+        <w:t xml:space="preserve">        - name: app</w:t>
+      </w:r>
+      <w:r>
+        <w:br/>
+      </w:r>
+      <w:r>
+        <w:rPr>
+          <w:rStyle w:val="StringTok"/>
+        </w:rPr>
+        <w:t xml:space="preserve">          image: busybox:1.36</w:t>
+      </w:r>
+      <w:r>
+        <w:br/>
+      </w:r>
+      <w:r>
+        <w:rPr>
+          <w:rStyle w:val="StringTok"/>
+        </w:rPr>
+        <w:t xml:space="preserve">          command: ["sh","-c","sleep 3600"]</w:t>
+      </w:r>
+      <w:r>
+        <w:br/>
+      </w:r>
+      <w:r>
+        <w:rPr>
+          <w:rStyle w:val="StringTok"/>
+        </w:rPr>
+        <w:t xml:space="preserve">          volumeMounts: [{name: data, mountPath: /data}]</w:t>
+      </w:r>
+      <w:r>
+        <w:br/>
+      </w:r>
+      <w:r>
+        <w:rPr>
+          <w:rStyle w:val="StringTok"/>
+        </w:rPr>
+        <w:t xml:space="preserve">  volumeClaimTemplates:</w:t>
+      </w:r>
+      <w:r>
+        <w:br/>
+      </w:r>
+      <w:r>
+        <w:rPr>
+          <w:rStyle w:val="StringTok"/>
+        </w:rPr>
+        <w:t xml:space="preserve">    - metadata: {name: data}</w:t>
+      </w:r>
+      <w:r>
+        <w:br/>
+      </w:r>
+      <w:r>
+        <w:rPr>
+          <w:rStyle w:val="StringTok"/>
+        </w:rPr>
+        <w:t xml:space="preserve">      spec:</w:t>
+      </w:r>
+      <w:r>
+        <w:br/>
+      </w:r>
+      <w:r>
+        <w:rPr>
+          <w:rStyle w:val="StringTok"/>
+        </w:rPr>
+        <w:t xml:space="preserve">        accessModes: ["ReadWriteOnce"]</w:t>
+      </w:r>
+      <w:r>
+        <w:br/>
+      </w:r>
+      <w:r>
+        <w:rPr>
+          <w:rStyle w:val="StringTok"/>
+        </w:rPr>
+        <w:t xml:space="preserve">        storageClassName: standard-rwo</w:t>
+      </w:r>
+      <w:r>
+        <w:br/>
+      </w:r>
+      <w:r>
+        <w:rPr>
+          <w:rStyle w:val="StringTok"/>
+        </w:rPr>
+        <w:t xml:space="preserve">        resources: {requests: {storage: 1Gi}}</w:t>
+      </w:r>
+      <w:r>
+        <w:br/>
+      </w:r>
+      <w:r>
+        <w:rPr>
+          <w:rStyle w:val="OperatorTok"/>
+        </w:rPr>
+        <w:t xml:space="preserve">EOF</w:t>
+      </w:r>
+      <w:r>
+        <w:br/>
+      </w:r>
+      <w:r>
+        <w:rPr>
+          <w:rStyle w:val="ExtensionTok"/>
+        </w:rPr>
+        <w:t xml:space="preserve">kubectl</w:t>
+      </w:r>
+      <w:r>
+        <w:rPr>
+          <w:rStyle w:val="NormalTok"/>
+        </w:rPr>
+        <w:t xml:space="preserve"> rollout status statefulset/db </w:t>
+      </w:r>
+      <w:r>
+        <w:rPr>
+          <w:rStyle w:val="AttributeTok"/>
+        </w:rPr>
+        <w:t xml:space="preserve">--timeout</w:t>
+      </w:r>
+      <w:r>
+        <w:rPr>
+          <w:rStyle w:val="OperatorTok"/>
+        </w:rPr>
+        <w:t xml:space="preserve">=</w:t>
+      </w:r>
+      <w:r>
+        <w:rPr>
+          <w:rStyle w:val="NormalTok"/>
+        </w:rPr>
+        <w:t xml:space="preserve">120s</w:t>
+      </w:r>
+      <w:r>
+        <w:br/>
+      </w:r>
+      <w:r>
+        <w:br/>
+      </w:r>
+      <w:r>
+        <w:rPr>
+          <w:rStyle w:val="ExtensionTok"/>
+        </w:rPr>
+        <w:t xml:space="preserve">kubectl</w:t>
+      </w:r>
+      <w:r>
+        <w:rPr>
+          <w:rStyle w:val="NormalTok"/>
+        </w:rPr>
+        <w:t xml:space="preserve"> exec db-0 </w:t>
+      </w:r>
+      <w:r>
+        <w:rPr>
+          <w:rStyle w:val="AttributeTok"/>
+        </w:rPr>
+        <w:t xml:space="preserve">--</w:t>
+      </w:r>
+      <w:r>
+        <w:rPr>
+          <w:rStyle w:val="NormalTok"/>
+        </w:rPr>
+        <w:t xml:space="preserve"> sh </w:t>
+      </w:r>
+      <w:r>
+        <w:rPr>
+          <w:rStyle w:val="AttributeTok"/>
+        </w:rPr>
+        <w:t xml:space="preserve">-c</w:t>
+      </w:r>
+      <w:r>
+        <w:rPr>
+          <w:rStyle w:val="NormalTok"/>
+        </w:rPr>
+        <w:t xml:space="preserve"> </w:t>
+      </w:r>
+      <w:r>
+        <w:rPr>
+          <w:rStyle w:val="StringTok"/>
+        </w:rPr>
+        <w:t xml:space="preserve">'echo "important-data-v1" &gt; /data/message; cat /data/message'</w:t>
+      </w:r>
+      <w:r>
+        <w:br/>
+      </w:r>
+      <w:r>
+        <w:rPr>
+          <w:rStyle w:val="ExtensionTok"/>
+        </w:rPr>
+        <w:t xml:space="preserve">kubectl</w:t>
+      </w:r>
+      <w:r>
+        <w:rPr>
+          <w:rStyle w:val="NormalTok"/>
+        </w:rPr>
+        <w:t xml:space="preserve"> get pvc data-db-0</w:t>
+      </w:r>
+    </w:p>
+    <w:p>
+      <w:pPr>
+        <w:pStyle w:val="FirstParagraph"/>
+      </w:pPr>
+      <w:r>
+        <w:rPr>
+          <w:b/>
+          <w:bCs/>
+        </w:rPr>
+        <w:t xml:space="preserve">What you should see:</w:t>
+      </w:r>
+      <w:r>
+        <w:t xml:space="preserve"> </w:t>
+      </w:r>
+      <w:r>
+        <w:t xml:space="preserve">the rollout completes,</w:t>
+      </w:r>
+      <w:r>
+        <w:t xml:space="preserve"> </w:t>
+      </w:r>
+      <w:r>
+        <w:rPr>
+          <w:rStyle w:val="VerbatimChar"/>
+        </w:rPr>
+        <w:t xml:space="preserve">cat /data/message</w:t>
+      </w:r>
+      <w:r>
+        <w:t xml:space="preserve"> </w:t>
+      </w:r>
+      <w:r>
+        <w:t xml:space="preserve">prints</w:t>
+      </w:r>
+      <w:r>
+        <w:t xml:space="preserve"> </w:t>
+      </w:r>
+      <w:r>
+        <w:rPr>
+          <w:rStyle w:val="VerbatimChar"/>
+        </w:rPr>
+        <w:t xml:space="preserve">important-data-v1</w:t>
+      </w:r>
+      <w:r>
+        <w:t xml:space="preserve">, and</w:t>
+      </w:r>
+      <w:r>
+        <w:t xml:space="preserve"> </w:t>
+      </w:r>
+      <w:r>
+        <w:rPr>
+          <w:rStyle w:val="VerbatimChar"/>
+        </w:rPr>
+        <w:t xml:space="preserve">kubectl get pvc data-db-0</w:t>
+      </w:r>
+      <w:r>
+        <w:t xml:space="preserve"> </w:t>
+      </w:r>
+      <w:r>
+        <w:t xml:space="preserve">shows a</w:t>
+      </w:r>
+      <w:r>
+        <w:t xml:space="preserve"> </w:t>
+      </w:r>
+      <w:r>
+        <w:rPr>
+          <w:rStyle w:val="VerbatimChar"/>
+        </w:rPr>
+        <w:t xml:space="preserve">Bound</w:t>
+      </w:r>
+      <w:r>
+        <w:t xml:space="preserve"> </w:t>
+      </w:r>
+      <w:r>
+        <w:t xml:space="preserve">1Gi PVC.</w:t>
+      </w:r>
+    </w:p>
+    <w:p>
+      <w:pPr>
+        <w:pStyle w:val="BodyText"/>
+      </w:pPr>
+      <w:r>
+        <w:drawing>
+          <wp:inline>
+            <wp:extent cx="5943600" cy="4116751"/>
+            <wp:effectExtent b="0" l="0" r="0" t="0"/>
+            <wp:docPr descr="StatefulSet running, data written, PVC bound" title="" id="18" name="Picture"/>
+            <a:graphic>
+              <a:graphicData uri="http://schemas.openxmlformats.org/drawingml/2006/picture">
+                <pic:pic>
+                  <pic:nvPicPr>
+                    <pic:cNvPr descr="../artifacts/lab-11/screenshots/01-statefulset-data.png" id="19" name="Picture"/>
+                    <pic:cNvPicPr>
+                      <a:picLocks noChangeArrowheads="1" noChangeAspect="1"/>
+                    </pic:cNvPicPr>
+                  </pic:nvPicPr>
+                  <pic:blipFill>
+                    <a:blip r:embed="rId17"/>
                     <a:stretch>
                       <a:fillRect/>
                     </a:stretch>
@@ -1878,8 +1869,8 @@
         </w:pict>
       </w:r>
     </w:p>
-    <w:bookmarkEnd w:id="17"/>
-    <w:bookmarkStart w:id="21" w:name="step-2--snapshot-the-volume"/>
+    <w:bookmarkEnd w:id="20"/>
+    <w:bookmarkStart w:id="24" w:name="step-2--snapshot-the-volume"/>
     <w:p>
       <w:pPr>
         <w:pStyle w:val="Heading2"/>
@@ -2318,18 +2309,18 @@
           <wp:inline>
             <wp:extent cx="5943600" cy="4116751"/>
             <wp:effectExtent b="0" l="0" r="0" t="0"/>
-            <wp:docPr descr="Snapshot readyToUse=true, restoreSize 1Gi" title="" id="19" name="Picture"/>
+            <wp:docPr descr="Snapshot readyToUse=true, restoreSize 1Gi" title="" id="22" name="Picture"/>
             <a:graphic>
               <a:graphicData uri="http://schemas.openxmlformats.org/drawingml/2006/picture">
                 <pic:pic>
                   <pic:nvPicPr>
-                    <pic:cNvPr descr="../artifacts/lab-11/screenshots/02-snapshot-ready.png" id="20" name="Picture"/>
+                    <pic:cNvPr descr="../artifacts/lab-11/screenshots/02-snapshot-ready.png" id="23" name="Picture"/>
                     <pic:cNvPicPr>
                       <a:picLocks noChangeArrowheads="1" noChangeAspect="1"/>
                     </pic:cNvPicPr>
                   </pic:nvPicPr>
                   <pic:blipFill>
-                    <a:blip r:embed="rId18"/>
+                    <a:blip r:embed="rId21"/>
                     <a:stretch>
                       <a:fillRect/>
                     </a:stretch>
@@ -2381,8 +2372,8 @@
         </w:pict>
       </w:r>
     </w:p>
-    <w:bookmarkEnd w:id="21"/>
-    <w:bookmarkStart w:id="25" w:name="step-3--simulate-a-disaster"/>
+    <w:bookmarkEnd w:id="24"/>
+    <w:bookmarkStart w:id="28" w:name="step-3--simulate-a-disaster"/>
     <w:p>
       <w:pPr>
         <w:pStyle w:val="Heading2"/>
@@ -2544,18 +2535,18 @@
           <wp:inline>
             <wp:extent cx="5943600" cy="4116751"/>
             <wp:effectExtent b="0" l="0" r="0" t="0"/>
-            <wp:docPr descr="StatefulSet and PVC deleted; snapshot survives" title="" id="23" name="Picture"/>
+            <wp:docPr descr="StatefulSet and PVC deleted; snapshot survives" title="" id="26" name="Picture"/>
             <a:graphic>
               <a:graphicData uri="http://schemas.openxmlformats.org/drawingml/2006/picture">
                 <pic:pic>
                   <pic:nvPicPr>
-                    <pic:cNvPr descr="../artifacts/lab-11/screenshots/03-destroyed.png" id="24" name="Picture"/>
+                    <pic:cNvPr descr="../artifacts/lab-11/screenshots/03-destroyed.png" id="27" name="Picture"/>
                     <pic:cNvPicPr>
                       <a:picLocks noChangeArrowheads="1" noChangeAspect="1"/>
                     </pic:cNvPicPr>
                   </pic:nvPicPr>
                   <pic:blipFill>
-                    <a:blip r:embed="rId22"/>
+                    <a:blip r:embed="rId25"/>
                     <a:stretch>
                       <a:fillRect/>
                     </a:stretch>
@@ -2607,8 +2598,8 @@
         </w:pict>
       </w:r>
     </w:p>
-    <w:bookmarkEnd w:id="25"/>
-    <w:bookmarkStart w:id="30" w:name="X4ad7b7ce2eedf73128e6ed6abec4c34eb3e4588"/>
+    <w:bookmarkEnd w:id="28"/>
+    <w:bookmarkStart w:id="33" w:name="X4ad7b7ce2eedf73128e6ed6abec4c34eb3e4588"/>
     <w:p>
       <w:pPr>
         <w:pStyle w:val="Heading2"/>
@@ -3030,18 +3021,18 @@
           <wp:inline>
             <wp:extent cx="5943600" cy="4116751"/>
             <wp:effectExtent b="0" l="0" r="0" t="0"/>
-            <wp:docPr descr="Restored volume — original data intact" title="" id="27" name="Picture"/>
+            <wp:docPr descr="Restored volume — original data intact" title="" id="30" name="Picture"/>
             <a:graphic>
               <a:graphicData uri="http://schemas.openxmlformats.org/drawingml/2006/picture">
                 <pic:pic>
                   <pic:nvPicPr>
-                    <pic:cNvPr descr="../artifacts/lab-11/screenshots/04-restored-verified.png" id="28" name="Picture"/>
+                    <pic:cNvPr descr="../artifacts/lab-11/screenshots/04-restored-verified.png" id="31" name="Picture"/>
                     <pic:cNvPicPr>
                       <a:picLocks noChangeArrowheads="1" noChangeAspect="1"/>
                     </pic:cNvPicPr>
                   </pic:nvPicPr>
                   <pic:blipFill>
-                    <a:blip r:embed="rId26"/>
+                    <a:blip r:embed="rId29"/>
                     <a:stretch>
                       <a:fillRect/>
                     </a:stretch>
@@ -3168,7 +3159,7 @@
       <w:r>
         <w:t xml:space="preserve"> </w:t>
       </w:r>
-      <w:hyperlink r:id="rId29">
+      <w:hyperlink r:id="rId32">
         <w:r>
           <w:rPr>
             <w:rStyle w:val="Hyperlink"/>
@@ -3187,8 +3178,8 @@
         </w:pict>
       </w:r>
     </w:p>
-    <w:bookmarkEnd w:id="30"/>
-    <w:bookmarkStart w:id="35" w:name="X3ea540206ca679e9e30d6779a445fff9357053c"/>
+    <w:bookmarkEnd w:id="33"/>
+    <w:bookmarkStart w:id="38" w:name="X3ea540206ca679e9e30d6779a445fff9357053c"/>
     <w:p>
       <w:pPr>
         <w:pStyle w:val="Heading2"/>
@@ -3423,18 +3414,18 @@
           <wp:inline>
             <wp:extent cx="5943600" cy="694320"/>
             <wp:effectExtent b="0" l="0" r="0" t="0"/>
-            <wp:docPr descr="The three StorageClasses side by side: csi-hostpath-sc allows expansion, csi-hostpath-noexpand forbids it, and kind's default standard has no value at all" title="" id="32" name="Picture"/>
+            <wp:docPr descr="The three StorageClasses side by side: csi-hostpath-sc allows expansion, csi-hostpath-noexpand forbids it, and kind's default standard has no value at all" title="" id="35" name="Picture"/>
             <a:graphic>
               <a:graphicData uri="http://schemas.openxmlformats.org/drawingml/2006/picture">
                 <pic:pic>
                   <pic:nvPicPr>
-                    <pic:cNvPr descr="../artifacts/lab-11/screenshots/05-storageclass-expansion.png" id="33" name="Picture"/>
+                    <pic:cNvPr descr="../artifacts/lab-11/screenshots/05-storageclass-expansion.png" id="36" name="Picture"/>
                     <pic:cNvPicPr>
                       <a:picLocks noChangeArrowheads="1" noChangeAspect="1"/>
                     </pic:cNvPicPr>
                   </pic:nvPicPr>
                   <pic:blipFill>
-                    <a:blip r:embed="rId31"/>
+                    <a:blip r:embed="rId34"/>
                     <a:stretch>
                       <a:fillRect/>
                     </a:stretch>
@@ -4327,7 +4318,7 @@
       <w:r>
         <w:t xml:space="preserve"> </w:t>
       </w:r>
-      <w:hyperlink r:id="rId34">
+      <w:hyperlink r:id="rId37">
         <w:r>
           <w:rPr>
             <w:rStyle w:val="VerbatimChar"/>
@@ -4679,8 +4670,8 @@
         </w:pict>
       </w:r>
     </w:p>
-    <w:bookmarkEnd w:id="35"/>
-    <w:bookmarkStart w:id="45" w:name="X90d66412ba714498840561ec48bea3e6a424846"/>
+    <w:bookmarkEnd w:id="38"/>
+    <w:bookmarkStart w:id="48" w:name="X90d66412ba714498840561ec48bea3e6a424846"/>
     <w:p>
       <w:pPr>
         <w:pStyle w:val="Heading2"/>
@@ -5230,18 +5221,18 @@
           <wp:inline>
             <wp:extent cx="5943600" cy="1747958"/>
             <wp:effectExtent b="0" l="0" r="0" t="0"/>
-            <wp:docPr descr="Phase one: the PVC requests 3Gi but reports 1Gi with Resizing and FileSystemResizePending both True, while the PV has already grown to 3Gi — and the events name volume_expand, then external-resizer, then FileSystemResizeRequired" title="" id="37" name="Picture"/>
+            <wp:docPr descr="Phase one: the PVC requests 3Gi but reports 1Gi with Resizing and FileSystemResizePending both True, while the PV has already grown to 3Gi — and the events name volume_expand, then external-resizer, then FileSystemResizeRequired" title="" id="40" name="Picture"/>
             <a:graphic>
               <a:graphicData uri="http://schemas.openxmlformats.org/drawingml/2006/picture">
                 <pic:pic>
                   <pic:nvPicPr>
-                    <pic:cNvPr descr="../artifacts/lab-11/screenshots/06-expansion-phase-1-controller.png" id="38" name="Picture"/>
+                    <pic:cNvPr descr="../artifacts/lab-11/screenshots/06-expansion-phase-1-controller.png" id="41" name="Picture"/>
                     <pic:cNvPicPr>
                       <a:picLocks noChangeArrowheads="1" noChangeAspect="1"/>
                     </pic:cNvPicPr>
                   </pic:nvPicPr>
                   <pic:blipFill>
-                    <a:blip r:embed="rId36"/>
+                    <a:blip r:embed="rId39"/>
                     <a:stretch>
                       <a:fillRect/>
                     </a:stretch>
@@ -5554,555 +5545,12 @@
           <wp:inline>
             <wp:extent cx="5943600" cy="856418"/>
             <wp:effectExtent b="0" l="0" r="0" t="0"/>
-            <wp:docPr descr="Phase two: after the Pod restarts, status.capacity reaches 3Gi, the conditions clear, and the file written before the resize is still there" title="" id="40" name="Picture"/>
+            <wp:docPr descr="Phase two: after the Pod restarts, status.capacity reaches 3Gi, the conditions clear, and the file written before the resize is still there" title="" id="43" name="Picture"/>
             <a:graphic>
               <a:graphicData uri="http://schemas.openxmlformats.org/drawingml/2006/picture">
                 <pic:pic>
                   <pic:nvPicPr>
-                    <pic:cNvPr descr="../artifacts/lab-11/screenshots/07-expansion-phase-2-node.png" id="41" name="Picture"/>
-                    <pic:cNvPicPr>
-                      <a:picLocks noChangeArrowheads="1" noChangeAspect="1"/>
-                    </pic:cNvPicPr>
-                  </pic:nvPicPr>
-                  <pic:blipFill>
-                    <a:blip r:embed="rId39"/>
-                    <a:stretch>
-                      <a:fillRect/>
-                    </a:stretch>
-                  </pic:blipFill>
-                  <pic:spPr bwMode="auto">
-                    <a:xfrm>
-                      <a:off x="0" y="0"/>
-                      <a:ext cx="5943600" cy="856418"/>
-                    </a:xfrm>
-                    <a:prstGeom prst="rect">
-                      <a:avLst/>
-                    </a:prstGeom>
-                    <a:noFill/>
-                    <a:ln w="9525">
-                      <a:noFill/>
-                      <a:headEnd/>
-                      <a:tailEnd/>
-                    </a:ln>
-                  </pic:spPr>
-                </pic:pic>
-              </a:graphicData>
-            </a:graphic>
-          </wp:inline>
-        </w:drawing>
-      </w:r>
-    </w:p>
-    <w:p>
-      <w:pPr>
-        <w:pStyle w:val="BlockText"/>
-      </w:pPr>
-      <w:r>
-        <w:t xml:space="preserve">⚠️</w:t>
-      </w:r>
-      <w:r>
-        <w:t xml:space="preserve"> </w:t>
-      </w:r>
-      <w:r>
-        <w:rPr>
-          <w:b/>
-          <w:bCs/>
-        </w:rPr>
-        <w:t xml:space="preserve">Gotcha — whether you need the restart depends on the driver.</w:t>
-      </w:r>
-      <w:r>
-        <w:t xml:space="preserve"> </w:t>
-      </w:r>
-      <w:r>
-        <w:t xml:space="preserve">Drivers that support</w:t>
-      </w:r>
-      <w:r>
-        <w:t xml:space="preserve"> </w:t>
-      </w:r>
-      <w:r>
-        <w:rPr>
-          <w:i/>
-          <w:iCs/>
-        </w:rPr>
-        <w:t xml:space="preserve">online</w:t>
-      </w:r>
-      <w:r>
-        <w:t xml:space="preserve"> </w:t>
-      </w:r>
-      <w:r>
-        <w:t xml:space="preserve">expansion complete</w:t>
-      </w:r>
-      <w:r>
-        <w:t xml:space="preserve"> </w:t>
-      </w:r>
-      <w:r>
-        <w:rPr>
-          <w:rStyle w:val="VerbatimChar"/>
-        </w:rPr>
-        <w:t xml:space="preserve">NodeExpandVolume</w:t>
-      </w:r>
-      <w:r>
-        <w:t xml:space="preserve"> </w:t>
-      </w:r>
-      <w:r>
-        <w:t xml:space="preserve">on the mounted volume with no restart, and you never see</w:t>
-      </w:r>
-      <w:r>
-        <w:t xml:space="preserve"> </w:t>
-      </w:r>
-      <w:r>
-        <w:rPr>
-          <w:rStyle w:val="VerbatimChar"/>
-        </w:rPr>
-        <w:t xml:space="preserve">FileSystemResizePending</w:t>
-      </w:r>
-      <w:r>
-        <w:t xml:space="preserve"> </w:t>
-      </w:r>
-      <w:r>
-        <w:t xml:space="preserve">for more than a moment. The hostpath driver here, like many block drivers, needs the remount. Check your driver's docs before promising a zero-downtime resize.</w:t>
-      </w:r>
-    </w:p>
-    <w:p>
-      <w:pPr>
-        <w:pStyle w:val="BlockText"/>
-      </w:pPr>
-      <w:r>
-        <w:t xml:space="preserve">⚠️</w:t>
-      </w:r>
-      <w:r>
-        <w:t xml:space="preserve"> </w:t>
-      </w:r>
-      <w:r>
-        <w:rPr>
-          <w:b/>
-          <w:bCs/>
-        </w:rPr>
-        <w:t xml:space="preserve">Gotcha —</w:t>
-      </w:r>
-      <w:r>
-        <w:rPr>
-          <w:b/>
-          <w:bCs/>
-        </w:rPr>
-        <w:t xml:space="preserve"> </w:t>
-      </w:r>
-      <w:r>
-        <w:rPr>
-          <w:rStyle w:val="VerbatimChar"/>
-          <w:b/>
-          <w:bCs/>
-        </w:rPr>
-        <w:t xml:space="preserve">df</w:t>
-      </w:r>
-      <w:r>
-        <w:rPr>
-          <w:b/>
-          <w:bCs/>
-        </w:rPr>
-        <w:t xml:space="preserve"> </w:t>
-      </w:r>
-      <w:r>
-        <w:rPr>
-          <w:b/>
-          <w:bCs/>
-        </w:rPr>
-        <w:t xml:space="preserve">inside the Pod will not confirm this on the hostpath driver.</w:t>
-      </w:r>
-      <w:r>
-        <w:t xml:space="preserve"> </w:t>
-      </w:r>
-      <w:r>
-        <w:t xml:space="preserve">Because the hostpath driver bind-mounts a directory from the node's filesystem rather than formatting a device,</w:t>
-      </w:r>
-      <w:r>
-        <w:t xml:space="preserve"> </w:t>
-      </w:r>
-      <w:r>
-        <w:rPr>
-          <w:rStyle w:val="VerbatimChar"/>
-        </w:rPr>
-        <w:t xml:space="preserve">df -h /data</w:t>
-      </w:r>
-      <w:r>
-        <w:t xml:space="preserve"> </w:t>
-      </w:r>
-      <w:r>
-        <w:t xml:space="preserve">reports the</w:t>
-      </w:r>
-      <w:r>
-        <w:t xml:space="preserve"> </w:t>
-      </w:r>
-      <w:r>
-        <w:rPr>
-          <w:i/>
-          <w:iCs/>
-        </w:rPr>
-        <w:t xml:space="preserve">node's</w:t>
-      </w:r>
-      <w:r>
-        <w:t xml:space="preserve"> </w:t>
-      </w:r>
-      <w:r>
-        <w:t xml:space="preserve">disk (here</w:t>
-      </w:r>
-      <w:r>
-        <w:t xml:space="preserve"> </w:t>
-      </w:r>
-      <w:r>
-        <w:rPr>
-          <w:rStyle w:val="VerbatimChar"/>
-        </w:rPr>
-        <w:t xml:space="preserve">452.1G</w:t>
-      </w:r>
-      <w:r>
-        <w:t xml:space="preserve">) both before and after. The Kubernetes-level resize is real — the PV, the PVC status and both CSI RPCs all prove it — but the filesystem is not a separate device. On GKE PD or Nutanix CSI,</w:t>
-      </w:r>
-      <w:r>
-        <w:t xml:space="preserve"> </w:t>
-      </w:r>
-      <w:r>
-        <w:rPr>
-          <w:rStyle w:val="VerbatimChar"/>
-        </w:rPr>
-        <w:t xml:space="preserve">df</w:t>
-      </w:r>
-      <w:r>
-        <w:t xml:space="preserve"> </w:t>
-      </w:r>
-      <w:r>
-        <w:rPr>
-          <w:b/>
-          <w:bCs/>
-        </w:rPr>
-        <w:t xml:space="preserve">does</w:t>
-      </w:r>
-      <w:r>
-        <w:t xml:space="preserve"> </w:t>
-      </w:r>
-      <w:r>
-        <w:t xml:space="preserve">change, and that is the check to use there.</w:t>
-      </w:r>
-    </w:p>
-    <w:p>
-      <w:pPr>
-        <w:pStyle w:val="FirstParagraph"/>
-      </w:pPr>
-      <w:r>
-        <w:rPr>
-          <w:b/>
-          <w:bCs/>
-        </w:rPr>
-        <w:t xml:space="preserve">5. Two refusals worth seeing once.</w:t>
-      </w:r>
-      <w:r>
-        <w:t xml:space="preserve"> </w:t>
-      </w:r>
-      <w:r>
-        <w:t xml:space="preserve">The second needs a claim on a class that forbids expansion:</w:t>
-      </w:r>
-    </w:p>
-    <w:p>
-      <w:pPr>
-        <w:pStyle w:val="SourceCode"/>
-      </w:pPr>
-      <w:r>
-        <w:rPr>
-          <w:rStyle w:val="ExtensionTok"/>
-        </w:rPr>
-        <w:t xml:space="preserve">kubectl</w:t>
-      </w:r>
-      <w:r>
-        <w:rPr>
-          <w:rStyle w:val="NormalTok"/>
-        </w:rPr>
-        <w:t xml:space="preserve"> apply </w:t>
-      </w:r>
-      <w:r>
-        <w:rPr>
-          <w:rStyle w:val="AttributeTok"/>
-        </w:rPr>
-        <w:t xml:space="preserve">-f</w:t>
-      </w:r>
-      <w:r>
-        <w:rPr>
-          <w:rStyle w:val="NormalTok"/>
-        </w:rPr>
-        <w:t xml:space="preserve"> </w:t>
-      </w:r>
-      <w:r>
-        <w:rPr>
-          <w:rStyle w:val="AttributeTok"/>
-        </w:rPr>
-        <w:t xml:space="preserve">-</w:t>
-      </w:r>
-      <w:r>
-        <w:rPr>
-          <w:rStyle w:val="NormalTok"/>
-        </w:rPr>
-        <w:t xml:space="preserve"> </w:t>
-      </w:r>
-      <w:r>
-        <w:rPr>
-          <w:rStyle w:val="OperatorTok"/>
-        </w:rPr>
-        <w:t xml:space="preserve">&lt;&lt;'EOF'</w:t>
-      </w:r>
-      <w:r>
-        <w:br/>
-      </w:r>
-      <w:r>
-        <w:rPr>
-          <w:rStyle w:val="StringTok"/>
-        </w:rPr>
-        <w:t xml:space="preserve">apiVersion: storage.k8s.io/v1</w:t>
-      </w:r>
-      <w:r>
-        <w:br/>
-      </w:r>
-      <w:r>
-        <w:rPr>
-          <w:rStyle w:val="StringTok"/>
-        </w:rPr>
-        <w:t xml:space="preserve">kind: StorageClass</w:t>
-      </w:r>
-      <w:r>
-        <w:br/>
-      </w:r>
-      <w:r>
-        <w:rPr>
-          <w:rStyle w:val="StringTok"/>
-        </w:rPr>
-        <w:t xml:space="preserve">metadata: { name: csi-hostpath-noexpand }</w:t>
-      </w:r>
-      <w:r>
-        <w:br/>
-      </w:r>
-      <w:r>
-        <w:rPr>
-          <w:rStyle w:val="StringTok"/>
-        </w:rPr>
-        <w:t xml:space="preserve">provisioner: hostpath.csi.k8s.io</w:t>
-      </w:r>
-      <w:r>
-        <w:br/>
-      </w:r>
-      <w:r>
-        <w:rPr>
-          <w:rStyle w:val="StringTok"/>
-        </w:rPr>
-        <w:t xml:space="preserve">allowVolumeExpansion: false</w:t>
-      </w:r>
-      <w:r>
-        <w:br/>
-      </w:r>
-      <w:r>
-        <w:rPr>
-          <w:rStyle w:val="StringTok"/>
-        </w:rPr>
-        <w:t xml:space="preserve">---</w:t>
-      </w:r>
-      <w:r>
-        <w:br/>
-      </w:r>
-      <w:r>
-        <w:rPr>
-          <w:rStyle w:val="StringTok"/>
-        </w:rPr>
-        <w:t xml:space="preserve">apiVersion: v1</w:t>
-      </w:r>
-      <w:r>
-        <w:br/>
-      </w:r>
-      <w:r>
-        <w:rPr>
-          <w:rStyle w:val="StringTok"/>
-        </w:rPr>
-        <w:t xml:space="preserve">kind: PersistentVolumeClaim</w:t>
-      </w:r>
-      <w:r>
-        <w:br/>
-      </w:r>
-      <w:r>
-        <w:rPr>
-          <w:rStyle w:val="StringTok"/>
-        </w:rPr>
-        <w:t xml:space="preserve">metadata: { name: locked-pvc }</w:t>
-      </w:r>
-      <w:r>
-        <w:br/>
-      </w:r>
-      <w:r>
-        <w:rPr>
-          <w:rStyle w:val="StringTok"/>
-        </w:rPr>
-        <w:t xml:space="preserve">spec:</w:t>
-      </w:r>
-      <w:r>
-        <w:br/>
-      </w:r>
-      <w:r>
-        <w:rPr>
-          <w:rStyle w:val="StringTok"/>
-        </w:rPr>
-        <w:t xml:space="preserve">  accessModes: ["ReadWriteOnce"]</w:t>
-      </w:r>
-      <w:r>
-        <w:br/>
-      </w:r>
-      <w:r>
-        <w:rPr>
-          <w:rStyle w:val="StringTok"/>
-        </w:rPr>
-        <w:t xml:space="preserve">  storageClassName: csi-hostpath-noexpand</w:t>
-      </w:r>
-      <w:r>
-        <w:br/>
-      </w:r>
-      <w:r>
-        <w:rPr>
-          <w:rStyle w:val="StringTok"/>
-        </w:rPr>
-        <w:t xml:space="preserve">  resources: { requests: { storage: 1Gi } }</w:t>
-      </w:r>
-      <w:r>
-        <w:br/>
-      </w:r>
-      <w:r>
-        <w:rPr>
-          <w:rStyle w:val="OperatorTok"/>
-        </w:rPr>
-        <w:t xml:space="preserve">EOF</w:t>
-      </w:r>
-    </w:p>
-    <w:p>
-      <w:pPr>
-        <w:pStyle w:val="SourceCode"/>
-      </w:pPr>
-      <w:r>
-        <w:rPr>
-          <w:rStyle w:val="VerbatimChar"/>
-        </w:rPr>
-        <w:t xml:space="preserve">$ kubectl patch pvc data-shop-db-0 --type merge -p '{"spec":{"resources":{"requests":{"storage":"1Gi"}}}}'</w:t>
-      </w:r>
-      <w:r>
-        <w:br/>
-      </w:r>
-      <w:r>
-        <w:rPr>
-          <w:rStyle w:val="VerbatimChar"/>
-        </w:rPr>
-        <w:t xml:space="preserve">The PersistentVolumeClaim "data-shop-db-0" is invalid: spec.resources.requests.storage:</w:t>
-      </w:r>
-      <w:r>
-        <w:br/>
-      </w:r>
-      <w:r>
-        <w:rPr>
-          <w:rStyle w:val="VerbatimChar"/>
-        </w:rPr>
-        <w:t xml:space="preserve">Forbidden: field can not be less than status.capacity</w:t>
-      </w:r>
-      <w:r>
-        <w:br/>
-      </w:r>
-      <w:r>
-        <w:br/>
-      </w:r>
-      <w:r>
-        <w:rPr>
-          <w:rStyle w:val="VerbatimChar"/>
-        </w:rPr>
-        <w:t xml:space="preserve">$ kubectl patch pvc locked-pvc --type merge -p '{"spec":{"resources":{"requests":{"storage":"2Gi"}}}}'</w:t>
-      </w:r>
-      <w:r>
-        <w:br/>
-      </w:r>
-      <w:r>
-        <w:rPr>
-          <w:rStyle w:val="VerbatimChar"/>
-        </w:rPr>
-        <w:t xml:space="preserve">Error from server (Forbidden): persistentvolumeclaims "locked-pvc" is forbidden:</w:t>
-      </w:r>
-      <w:r>
-        <w:br/>
-      </w:r>
-      <w:r>
-        <w:rPr>
-          <w:rStyle w:val="VerbatimChar"/>
-        </w:rPr>
-        <w:t xml:space="preserve">only dynamically provisioned pvc can be resized and the storageclass that provisions</w:t>
-      </w:r>
-      <w:r>
-        <w:br/>
-      </w:r>
-      <w:r>
-        <w:rPr>
-          <w:rStyle w:val="VerbatimChar"/>
-        </w:rPr>
-        <w:t xml:space="preserve">the pvc must support resize</w:t>
-      </w:r>
-    </w:p>
-    <w:p>
-      <w:pPr>
-        <w:pStyle w:val="FirstParagraph"/>
-      </w:pPr>
-      <w:r>
-        <w:rPr>
-          <w:b/>
-          <w:bCs/>
-        </w:rPr>
-        <w:t xml:space="preserve">Volumes only grow.</w:t>
-      </w:r>
-      <w:r>
-        <w:t xml:space="preserve"> </w:t>
-      </w:r>
-      <w:r>
-        <w:t xml:space="preserve">There is no shrink in Kubernetes — the API server rejects it outright — and expansion is gated on</w:t>
-      </w:r>
-      <w:r>
-        <w:t xml:space="preserve"> </w:t>
-      </w:r>
-      <w:r>
-        <w:rPr>
-          <w:rStyle w:val="VerbatimChar"/>
-        </w:rPr>
-        <w:t xml:space="preserve">allowVolumeExpansion</w:t>
-      </w:r>
-      <w:r>
-        <w:t xml:space="preserve"> </w:t>
-      </w:r>
-      <w:r>
-        <w:t xml:space="preserve">in the</w:t>
-      </w:r>
-      <w:r>
-        <w:t xml:space="preserve"> </w:t>
-      </w:r>
-      <w:r>
-        <w:rPr>
-          <w:b/>
-          <w:bCs/>
-        </w:rPr>
-        <w:t xml:space="preserve">StorageClass</w:t>
-      </w:r>
-      <w:r>
-        <w:t xml:space="preserve">, decided at provisioning time. Pick the class correctly up front; retrofitting means migrating data.</w:t>
-      </w:r>
-    </w:p>
-    <w:p>
-      <w:pPr>
-        <w:pStyle w:val="BodyText"/>
-      </w:pPr>
-      <w:r>
-        <w:drawing>
-          <wp:inline>
-            <wp:extent cx="5943600" cy="856418"/>
-            <wp:effectExtent b="0" l="0" r="0" t="0"/>
-            <wp:docPr descr="Both refusals: shrinking is rejected as less than status.capacity, and expanding a claim on a class without allowVolumeExpansion is forbidden outright" title="" id="43" name="Picture"/>
-            <a:graphic>
-              <a:graphicData uri="http://schemas.openxmlformats.org/drawingml/2006/picture">
-                <pic:pic>
-                  <pic:nvPicPr>
-                    <pic:cNvPr descr="../artifacts/lab-11/screenshots/08-expansion-refusals.png" id="44" name="Picture"/>
+                    <pic:cNvPr descr="../artifacts/lab-11/screenshots/07-expansion-phase-2-node.png" id="44" name="Picture"/>
                     <pic:cNvPicPr>
                       <a:picLocks noChangeArrowheads="1" noChangeAspect="1"/>
                     </pic:cNvPicPr>
@@ -6136,53 +5584,27 @@
       </w:r>
     </w:p>
     <w:p>
-      <w:r>
-        <w:pict>
-          <v:rect style="width:0;height:1.5pt" o:hralign="center" o:hrstd="t" o:hr="t"/>
-        </w:pict>
-      </w:r>
-    </w:p>
-    <w:bookmarkEnd w:id="45"/>
-    <w:bookmarkStart w:id="52" w:name="step-6--diagnose-a-multi-attach-failure"/>
-    <w:p>
-      <w:pPr>
-        <w:pStyle w:val="Heading2"/>
-      </w:pPr>
-      <w:r>
-        <w:t xml:space="preserve">Step 6 — Diagnose a multi-attach failure</w:t>
-      </w:r>
-    </w:p>
-    <w:p>
-      <w:pPr>
-        <w:pStyle w:val="FirstParagraph"/>
-      </w:pPr>
-      <w:r>
-        <w:rPr>
-          <w:b/>
-          <w:bCs/>
-        </w:rPr>
-        <w:t xml:space="preserve">Goal:</w:t>
-      </w:r>
-      <w:r>
-        <w:t xml:space="preserve"> </w:t>
-      </w:r>
-      <w:r>
-        <w:t xml:space="preserve">produce the classic</w:t>
-      </w:r>
-      <w:r>
-        <w:t xml:space="preserve"> </w:t>
-      </w:r>
-      <w:r>
-        <w:rPr>
-          <w:rStyle w:val="VerbatimChar"/>
-        </w:rPr>
-        <w:t xml:space="preserve">ReadWriteOnce</w:t>
-      </w:r>
-      <w:r>
-        <w:t xml:space="preserve"> </w:t>
-      </w:r>
-      <w:r>
-        <w:t xml:space="preserve">conflict on purpose, read the message correctly, and fix it — then meet the</w:t>
+      <w:pPr>
+        <w:pStyle w:val="BlockText"/>
+      </w:pPr>
+      <w:r>
+        <w:t xml:space="preserve">⚠️</w:t>
+      </w:r>
+      <w:r>
+        <w:t xml:space="preserve"> </w:t>
+      </w:r>
+      <w:r>
+        <w:rPr>
+          <w:b/>
+          <w:bCs/>
+        </w:rPr>
+        <w:t xml:space="preserve">Gotcha — whether you need the restart depends on the driver.</w:t>
+      </w:r>
+      <w:r>
+        <w:t xml:space="preserve"> </w:t>
+      </w:r>
+      <w:r>
+        <w:t xml:space="preserve">Drivers that support</w:t>
       </w:r>
       <w:r>
         <w:t xml:space="preserve"> </w:t>
@@ -6192,516 +5614,111 @@
           <w:i/>
           <w:iCs/>
         </w:rPr>
-        <w:t xml:space="preserve">second</w:t>
-      </w:r>
-      <w:r>
-        <w:t xml:space="preserve"> </w:t>
-      </w:r>
-      <w:r>
-        <w:t xml:space="preserve">failure hiding behind it.</w:t>
-      </w:r>
-    </w:p>
-    <w:p>
-      <w:pPr>
-        <w:pStyle w:val="BodyText"/>
-      </w:pPr>
-      <w:r>
-        <w:rPr>
-          <w:b/>
-          <w:bCs/>
-        </w:rPr>
-        <w:t xml:space="preserve">1. Find where the volume is attached, then deliberately put a second Pod somewhere else:</w:t>
-      </w:r>
-    </w:p>
-    <w:p>
-      <w:pPr>
-        <w:pStyle w:val="SourceCode"/>
-      </w:pPr>
-      <w:r>
-        <w:rPr>
-          <w:rStyle w:val="ExtensionTok"/>
-        </w:rPr>
-        <w:t xml:space="preserve">kubectl</w:t>
-      </w:r>
-      <w:r>
-        <w:rPr>
-          <w:rStyle w:val="NormalTok"/>
-        </w:rPr>
-        <w:t xml:space="preserve"> get pod shop-db-0 </w:t>
-      </w:r>
-      <w:r>
-        <w:rPr>
-          <w:rStyle w:val="AttributeTok"/>
-        </w:rPr>
-        <w:t xml:space="preserve">-o</w:t>
-      </w:r>
-      <w:r>
-        <w:rPr>
-          <w:rStyle w:val="NormalTok"/>
-        </w:rPr>
-        <w:t xml:space="preserve"> custom-columns=POD:.metadata.name,NODE:.spec.nodeName</w:t>
-      </w:r>
-    </w:p>
-    <w:p>
-      <w:pPr>
-        <w:pStyle w:val="SourceCode"/>
-      </w:pPr>
-      <w:r>
-        <w:rPr>
-          <w:rStyle w:val="VerbatimChar"/>
-        </w:rPr>
-        <w:t xml:space="preserve">POD         NODE</w:t>
-      </w:r>
-      <w:r>
-        <w:br/>
-      </w:r>
-      <w:r>
-        <w:rPr>
-          <w:rStyle w:val="VerbatimChar"/>
-        </w:rPr>
-        <w:t xml:space="preserve">shop-db-0   csistate-worker</w:t>
-      </w:r>
-    </w:p>
-    <w:p>
-      <w:pPr>
-        <w:pStyle w:val="SourceCode"/>
-      </w:pPr>
-      <w:r>
-        <w:rPr>
-          <w:rStyle w:val="ExtensionTok"/>
-        </w:rPr>
-        <w:t xml:space="preserve">kubectl</w:t>
-      </w:r>
-      <w:r>
-        <w:rPr>
-          <w:rStyle w:val="NormalTok"/>
-        </w:rPr>
-        <w:t xml:space="preserve"> apply </w:t>
-      </w:r>
-      <w:r>
-        <w:rPr>
-          <w:rStyle w:val="AttributeTok"/>
-        </w:rPr>
-        <w:t xml:space="preserve">-f</w:t>
-      </w:r>
-      <w:r>
-        <w:rPr>
-          <w:rStyle w:val="NormalTok"/>
-        </w:rPr>
-        <w:t xml:space="preserve"> </w:t>
-      </w:r>
-      <w:r>
-        <w:rPr>
-          <w:rStyle w:val="AttributeTok"/>
-        </w:rPr>
-        <w:t xml:space="preserve">-</w:t>
-      </w:r>
-      <w:r>
-        <w:rPr>
-          <w:rStyle w:val="NormalTok"/>
-        </w:rPr>
-        <w:t xml:space="preserve"> </w:t>
-      </w:r>
-      <w:r>
-        <w:rPr>
-          <w:rStyle w:val="OperatorTok"/>
-        </w:rPr>
-        <w:t xml:space="preserve">&lt;&lt;'EOF'</w:t>
-      </w:r>
-      <w:r>
-        <w:br/>
-      </w:r>
-      <w:r>
-        <w:rPr>
-          <w:rStyle w:val="StringTok"/>
-        </w:rPr>
-        <w:t xml:space="preserve">apiVersion: v1</w:t>
-      </w:r>
-      <w:r>
-        <w:br/>
-      </w:r>
-      <w:r>
-        <w:rPr>
-          <w:rStyle w:val="StringTok"/>
-        </w:rPr>
-        <w:t xml:space="preserve">kind: Pod</w:t>
-      </w:r>
-      <w:r>
-        <w:br/>
-      </w:r>
-      <w:r>
-        <w:rPr>
-          <w:rStyle w:val="StringTok"/>
-        </w:rPr>
-        <w:t xml:space="preserve">metadata: { name: report-runner }</w:t>
-      </w:r>
-      <w:r>
-        <w:br/>
-      </w:r>
-      <w:r>
-        <w:rPr>
-          <w:rStyle w:val="StringTok"/>
-        </w:rPr>
-        <w:t xml:space="preserve">spec:</w:t>
-      </w:r>
-      <w:r>
-        <w:br/>
-      </w:r>
-      <w:r>
-        <w:rPr>
-          <w:rStyle w:val="StringTok"/>
-        </w:rPr>
-        <w:t xml:space="preserve">  nodeName: csistate-worker2          # &lt;- the OTHER worker, on purpose</w:t>
-      </w:r>
-      <w:r>
-        <w:br/>
-      </w:r>
-      <w:r>
-        <w:rPr>
-          <w:rStyle w:val="StringTok"/>
-        </w:rPr>
-        <w:t xml:space="preserve">  containers:</w:t>
-      </w:r>
-      <w:r>
-        <w:br/>
-      </w:r>
-      <w:r>
-        <w:rPr>
-          <w:rStyle w:val="StringTok"/>
-        </w:rPr>
-        <w:t xml:space="preserve">    - name: app</w:t>
-      </w:r>
-      <w:r>
-        <w:br/>
-      </w:r>
-      <w:r>
-        <w:rPr>
-          <w:rStyle w:val="StringTok"/>
-        </w:rPr>
-        <w:t xml:space="preserve">      image: busybox:1.36</w:t>
-      </w:r>
-      <w:r>
-        <w:br/>
-      </w:r>
-      <w:r>
-        <w:rPr>
-          <w:rStyle w:val="StringTok"/>
-        </w:rPr>
-        <w:t xml:space="preserve">      command: ["sh","-c","cat /data/message; sleep 100000"]</w:t>
-      </w:r>
-      <w:r>
-        <w:br/>
-      </w:r>
-      <w:r>
-        <w:rPr>
-          <w:rStyle w:val="StringTok"/>
-        </w:rPr>
-        <w:t xml:space="preserve">      volumeMounts: [{ name: data, mountPath: /data }]</w:t>
-      </w:r>
-      <w:r>
-        <w:br/>
-      </w:r>
-      <w:r>
-        <w:rPr>
-          <w:rStyle w:val="StringTok"/>
-        </w:rPr>
-        <w:t xml:space="preserve">  volumes:</w:t>
-      </w:r>
-      <w:r>
-        <w:br/>
-      </w:r>
-      <w:r>
-        <w:rPr>
-          <w:rStyle w:val="StringTok"/>
-        </w:rPr>
-        <w:t xml:space="preserve">    - name: data</w:t>
-      </w:r>
-      <w:r>
-        <w:br/>
-      </w:r>
-      <w:r>
-        <w:rPr>
-          <w:rStyle w:val="StringTok"/>
-        </w:rPr>
-        <w:t xml:space="preserve">      persistentVolumeClaim: { claimName: data-shop-db-0 }</w:t>
-      </w:r>
-      <w:r>
-        <w:br/>
-      </w:r>
-      <w:r>
-        <w:rPr>
-          <w:rStyle w:val="OperatorTok"/>
-        </w:rPr>
-        <w:t xml:space="preserve">EOF</w:t>
-      </w:r>
-    </w:p>
-    <w:p>
-      <w:pPr>
-        <w:pStyle w:val="FirstParagraph"/>
-      </w:pPr>
-      <w:r>
-        <w:rPr>
-          <w:b/>
-          <w:bCs/>
-        </w:rPr>
-        <w:t xml:space="preserve">2. It hangs in</w:t>
-      </w:r>
-      <w:r>
-        <w:rPr>
-          <w:b/>
-          <w:bCs/>
-        </w:rPr>
-        <w:t xml:space="preserve"> </w:t>
-      </w:r>
-      <w:r>
-        <w:rPr>
-          <w:rStyle w:val="VerbatimChar"/>
-          <w:b/>
-          <w:bCs/>
-        </w:rPr>
-        <w:t xml:space="preserve">ContainerCreating</w:t>
-      </w:r>
-      <w:r>
-        <w:rPr>
-          <w:b/>
-          <w:bCs/>
-        </w:rPr>
-        <w:t xml:space="preserve">. Get the reason from the events:</w:t>
-      </w:r>
-    </w:p>
-    <w:p>
-      <w:pPr>
-        <w:pStyle w:val="SourceCode"/>
-      </w:pPr>
-      <w:r>
-        <w:rPr>
-          <w:rStyle w:val="VerbatimChar"/>
-        </w:rPr>
-        <w:t xml:space="preserve">$ kubectl get pod report-runner</w:t>
-      </w:r>
-      <w:r>
-        <w:br/>
-      </w:r>
-      <w:r>
-        <w:rPr>
-          <w:rStyle w:val="VerbatimChar"/>
-        </w:rPr>
-        <w:t xml:space="preserve">NAME            READY   STATUS              RESTARTS   AGE</w:t>
-      </w:r>
-      <w:r>
-        <w:br/>
-      </w:r>
-      <w:r>
-        <w:rPr>
-          <w:rStyle w:val="VerbatimChar"/>
-        </w:rPr>
-        <w:t xml:space="preserve">report-runner   0/1     ContainerCreating   0          45s</w:t>
-      </w:r>
-      <w:r>
-        <w:br/>
-      </w:r>
-      <w:r>
-        <w:br/>
-      </w:r>
-      <w:r>
-        <w:rPr>
-          <w:rStyle w:val="VerbatimChar"/>
-        </w:rPr>
-        <w:t xml:space="preserve">$ kubectl describe pod report-runner | sed -n '/Events/,$p'</w:t>
-      </w:r>
-      <w:r>
-        <w:br/>
-      </w:r>
-      <w:r>
-        <w:rPr>
-          <w:rStyle w:val="VerbatimChar"/>
-        </w:rPr>
-        <w:t xml:space="preserve">Warning  FailedAttachVolume  46s  attachdetach-controller  Waiting for detach for volume</w:t>
-      </w:r>
-      <w:r>
-        <w:br/>
-      </w:r>
-      <w:r>
-        <w:rPr>
-          <w:rStyle w:val="VerbatimChar"/>
-        </w:rPr>
-        <w:t xml:space="preserve">  "pvc-f833ee26-…" Volume is already used by pod(s) shop-db-0</w:t>
-      </w:r>
-      <w:r>
-        <w:br/>
-      </w:r>
-      <w:r>
-        <w:br/>
-      </w:r>
-      <w:r>
-        <w:rPr>
-          <w:rStyle w:val="VerbatimChar"/>
-        </w:rPr>
-        <w:t xml:space="preserve">$ kubectl get volumeattachment -o custom-columns=NODE:.spec.nodeName,ATTACHED:.status.attached</w:t>
-      </w:r>
-      <w:r>
-        <w:br/>
-      </w:r>
-      <w:r>
-        <w:rPr>
-          <w:rStyle w:val="VerbatimChar"/>
-        </w:rPr>
-        <w:t xml:space="preserve">NODE               ATTACHED</w:t>
-      </w:r>
-      <w:r>
-        <w:br/>
-      </w:r>
-      <w:r>
-        <w:rPr>
-          <w:rStyle w:val="VerbatimChar"/>
-        </w:rPr>
-        <w:t xml:space="preserve">csistate-worker   true</w:t>
-      </w:r>
-    </w:p>
-    <w:p>
-      <w:pPr>
-        <w:pStyle w:val="FirstParagraph"/>
-      </w:pPr>
-      <w:r>
-        <w:rPr>
-          <w:b/>
-          <w:bCs/>
-        </w:rPr>
-        <w:t xml:space="preserve">What this means.</w:t>
-      </w:r>
-      <w:r>
-        <w:t xml:space="preserve"> </w:t>
-      </w:r>
-      <w:r>
-        <w:t xml:space="preserve">A</w:t>
-      </w:r>
-      <w:r>
-        <w:t xml:space="preserve"> </w:t>
-      </w:r>
-      <w:r>
-        <w:rPr>
-          <w:rStyle w:val="VerbatimChar"/>
-        </w:rPr>
-        <w:t xml:space="preserve">ReadWriteOnce</w:t>
-      </w:r>
-      <w:r>
-        <w:t xml:space="preserve"> </w:t>
-      </w:r>
-      <w:r>
-        <w:t xml:space="preserve">volume can be attached to</w:t>
-      </w:r>
-      <w:r>
-        <w:t xml:space="preserve"> </w:t>
-      </w:r>
-      <w:r>
-        <w:rPr>
-          <w:b/>
-          <w:bCs/>
-        </w:rPr>
-        <w:t xml:space="preserve">one node</w:t>
-      </w:r>
-      <w:r>
-        <w:t xml:space="preserve"> </w:t>
-      </w:r>
-      <w:r>
-        <w:t xml:space="preserve">at a time. The</w:t>
-      </w:r>
-      <w:r>
-        <w:t xml:space="preserve"> </w:t>
-      </w:r>
-      <w:r>
-        <w:rPr>
-          <w:rStyle w:val="VerbatimChar"/>
-        </w:rPr>
-        <w:t xml:space="preserve">attachdetach-controller</w:t>
-      </w:r>
-      <w:r>
-        <w:t xml:space="preserve"> </w:t>
-      </w:r>
-      <w:r>
-        <w:t xml:space="preserve">in</w:t>
-      </w:r>
-      <w:r>
-        <w:t xml:space="preserve"> </w:t>
-      </w:r>
-      <w:r>
-        <w:rPr>
-          <w:rStyle w:val="VerbatimChar"/>
-        </w:rPr>
-        <w:t xml:space="preserve">kube-controller-manager</w:t>
-      </w:r>
-      <w:r>
-        <w:t xml:space="preserve"> </w:t>
-      </w:r>
-      <w:r>
-        <w:t xml:space="preserve">sees an existing</w:t>
-      </w:r>
-      <w:r>
-        <w:t xml:space="preserve"> </w:t>
-      </w:r>
-      <w:r>
-        <w:rPr>
-          <w:rStyle w:val="VerbatimChar"/>
-        </w:rPr>
-        <w:t xml:space="preserve">VolumeAttachment</w:t>
-      </w:r>
-      <w:r>
-        <w:t xml:space="preserve"> </w:t>
-      </w:r>
-      <w:r>
-        <w:t xml:space="preserve">for</w:t>
-      </w:r>
-      <w:r>
-        <w:t xml:space="preserve"> </w:t>
-      </w:r>
-      <w:r>
-        <w:rPr>
-          <w:rStyle w:val="VerbatimChar"/>
-        </w:rPr>
-        <w:t xml:space="preserve">csistate-worker</w:t>
-      </w:r>
-      <w:r>
-        <w:t xml:space="preserve"> </w:t>
-      </w:r>
-      <w:r>
-        <w:t xml:space="preserve">and refuses to create a second one for</w:t>
-      </w:r>
-      <w:r>
-        <w:t xml:space="preserve"> </w:t>
-      </w:r>
-      <w:r>
-        <w:rPr>
-          <w:rStyle w:val="VerbatimChar"/>
-        </w:rPr>
-        <w:t xml:space="preserve">csistate-worker2</w:t>
-      </w:r>
-      <w:r>
-        <w:t xml:space="preserve">. Notice there is still exactly</w:t>
-      </w:r>
-      <w:r>
-        <w:t xml:space="preserve"> </w:t>
-      </w:r>
-      <w:r>
-        <w:rPr>
-          <w:b/>
-          <w:bCs/>
-        </w:rPr>
-        <w:t xml:space="preserve">one</w:t>
-      </w:r>
-      <w:r>
-        <w:t xml:space="preserve"> </w:t>
-      </w:r>
-      <w:r>
-        <w:rPr>
-          <w:rStyle w:val="VerbatimChar"/>
-        </w:rPr>
-        <w:t xml:space="preserve">VolumeAttachment</w:t>
-      </w:r>
-      <w:r>
-        <w:t xml:space="preserve"> </w:t>
-      </w:r>
-      <w:r>
-        <w:t xml:space="preserve">— the conflict is resolved by</w:t>
+        <w:t xml:space="preserve">online</w:t>
+      </w:r>
+      <w:r>
+        <w:t xml:space="preserve"> </w:t>
+      </w:r>
+      <w:r>
+        <w:t xml:space="preserve">expansion complete</w:t>
+      </w:r>
+      <w:r>
+        <w:t xml:space="preserve"> </w:t>
+      </w:r>
+      <w:r>
+        <w:rPr>
+          <w:rStyle w:val="VerbatimChar"/>
+        </w:rPr>
+        <w:t xml:space="preserve">NodeExpandVolume</w:t>
+      </w:r>
+      <w:r>
+        <w:t xml:space="preserve"> </w:t>
+      </w:r>
+      <w:r>
+        <w:t xml:space="preserve">on the mounted volume with no restart, and you never see</w:t>
+      </w:r>
+      <w:r>
+        <w:t xml:space="preserve"> </w:t>
+      </w:r>
+      <w:r>
+        <w:rPr>
+          <w:rStyle w:val="VerbatimChar"/>
+        </w:rPr>
+        <w:t xml:space="preserve">FileSystemResizePending</w:t>
+      </w:r>
+      <w:r>
+        <w:t xml:space="preserve"> </w:t>
+      </w:r>
+      <w:r>
+        <w:t xml:space="preserve">for more than a moment. The hostpath driver here, like many block drivers, needs the remount. Check your driver's docs before promising a zero-downtime resize.</w:t>
+      </w:r>
+    </w:p>
+    <w:p>
+      <w:pPr>
+        <w:pStyle w:val="BlockText"/>
+      </w:pPr>
+      <w:r>
+        <w:t xml:space="preserve">⚠️</w:t>
+      </w:r>
+      <w:r>
+        <w:t xml:space="preserve"> </w:t>
+      </w:r>
+      <w:r>
+        <w:rPr>
+          <w:b/>
+          <w:bCs/>
+        </w:rPr>
+        <w:t xml:space="preserve">Gotcha —</w:t>
+      </w:r>
+      <w:r>
+        <w:rPr>
+          <w:b/>
+          <w:bCs/>
+        </w:rPr>
+        <w:t xml:space="preserve"> </w:t>
+      </w:r>
+      <w:r>
+        <w:rPr>
+          <w:rStyle w:val="VerbatimChar"/>
+          <w:b/>
+          <w:bCs/>
+        </w:rPr>
+        <w:t xml:space="preserve">df</w:t>
+      </w:r>
+      <w:r>
+        <w:rPr>
+          <w:b/>
+          <w:bCs/>
+        </w:rPr>
+        <w:t xml:space="preserve"> </w:t>
+      </w:r>
+      <w:r>
+        <w:rPr>
+          <w:b/>
+          <w:bCs/>
+        </w:rPr>
+        <w:t xml:space="preserve">inside the Pod will not confirm this on the hostpath driver.</w:t>
+      </w:r>
+      <w:r>
+        <w:t xml:space="preserve"> </w:t>
+      </w:r>
+      <w:r>
+        <w:t xml:space="preserve">Because the hostpath driver bind-mounts a directory from the node's filesystem rather than formatting a device,</w:t>
+      </w:r>
+      <w:r>
+        <w:t xml:space="preserve"> </w:t>
+      </w:r>
+      <w:r>
+        <w:rPr>
+          <w:rStyle w:val="VerbatimChar"/>
+        </w:rPr>
+        <w:t xml:space="preserve">df -h /data</w:t>
+      </w:r>
+      <w:r>
+        <w:t xml:space="preserve"> </w:t>
+      </w:r>
+      <w:r>
+        <w:t xml:space="preserve">reports the</w:t>
       </w:r>
       <w:r>
         <w:t xml:space="preserve"> </w:t>
@@ -6711,10 +5728,355 @@
           <w:i/>
           <w:iCs/>
         </w:rPr>
-        <w:t xml:space="preserve">not acting</w:t>
-      </w:r>
-      <w:r>
-        <w:t xml:space="preserve">, which is why the Pod waits forever rather than failing.</w:t>
+        <w:t xml:space="preserve">node's</w:t>
+      </w:r>
+      <w:r>
+        <w:t xml:space="preserve"> </w:t>
+      </w:r>
+      <w:r>
+        <w:t xml:space="preserve">disk (here</w:t>
+      </w:r>
+      <w:r>
+        <w:t xml:space="preserve"> </w:t>
+      </w:r>
+      <w:r>
+        <w:rPr>
+          <w:rStyle w:val="VerbatimChar"/>
+        </w:rPr>
+        <w:t xml:space="preserve">452.1G</w:t>
+      </w:r>
+      <w:r>
+        <w:t xml:space="preserve">) both before and after. The Kubernetes-level resize is real — the PV, the PVC status and both CSI RPCs all prove it — but the filesystem is not a separate device. On GKE PD or Nutanix CSI,</w:t>
+      </w:r>
+      <w:r>
+        <w:t xml:space="preserve"> </w:t>
+      </w:r>
+      <w:r>
+        <w:rPr>
+          <w:rStyle w:val="VerbatimChar"/>
+        </w:rPr>
+        <w:t xml:space="preserve">df</w:t>
+      </w:r>
+      <w:r>
+        <w:t xml:space="preserve"> </w:t>
+      </w:r>
+      <w:r>
+        <w:rPr>
+          <w:b/>
+          <w:bCs/>
+        </w:rPr>
+        <w:t xml:space="preserve">does</w:t>
+      </w:r>
+      <w:r>
+        <w:t xml:space="preserve"> </w:t>
+      </w:r>
+      <w:r>
+        <w:t xml:space="preserve">change, and that is the check to use there.</w:t>
+      </w:r>
+    </w:p>
+    <w:p>
+      <w:pPr>
+        <w:pStyle w:val="FirstParagraph"/>
+      </w:pPr>
+      <w:r>
+        <w:rPr>
+          <w:b/>
+          <w:bCs/>
+        </w:rPr>
+        <w:t xml:space="preserve">5. Two refusals worth seeing once.</w:t>
+      </w:r>
+      <w:r>
+        <w:t xml:space="preserve"> </w:t>
+      </w:r>
+      <w:r>
+        <w:t xml:space="preserve">The second needs a claim on a class that forbids expansion:</w:t>
+      </w:r>
+    </w:p>
+    <w:p>
+      <w:pPr>
+        <w:pStyle w:val="SourceCode"/>
+      </w:pPr>
+      <w:r>
+        <w:rPr>
+          <w:rStyle w:val="ExtensionTok"/>
+        </w:rPr>
+        <w:t xml:space="preserve">kubectl</w:t>
+      </w:r>
+      <w:r>
+        <w:rPr>
+          <w:rStyle w:val="NormalTok"/>
+        </w:rPr>
+        <w:t xml:space="preserve"> apply </w:t>
+      </w:r>
+      <w:r>
+        <w:rPr>
+          <w:rStyle w:val="AttributeTok"/>
+        </w:rPr>
+        <w:t xml:space="preserve">-f</w:t>
+      </w:r>
+      <w:r>
+        <w:rPr>
+          <w:rStyle w:val="NormalTok"/>
+        </w:rPr>
+        <w:t xml:space="preserve"> </w:t>
+      </w:r>
+      <w:r>
+        <w:rPr>
+          <w:rStyle w:val="AttributeTok"/>
+        </w:rPr>
+        <w:t xml:space="preserve">-</w:t>
+      </w:r>
+      <w:r>
+        <w:rPr>
+          <w:rStyle w:val="NormalTok"/>
+        </w:rPr>
+        <w:t xml:space="preserve"> </w:t>
+      </w:r>
+      <w:r>
+        <w:rPr>
+          <w:rStyle w:val="OperatorTok"/>
+        </w:rPr>
+        <w:t xml:space="preserve">&lt;&lt;'EOF'</w:t>
+      </w:r>
+      <w:r>
+        <w:br/>
+      </w:r>
+      <w:r>
+        <w:rPr>
+          <w:rStyle w:val="StringTok"/>
+        </w:rPr>
+        <w:t xml:space="preserve">apiVersion: storage.k8s.io/v1</w:t>
+      </w:r>
+      <w:r>
+        <w:br/>
+      </w:r>
+      <w:r>
+        <w:rPr>
+          <w:rStyle w:val="StringTok"/>
+        </w:rPr>
+        <w:t xml:space="preserve">kind: StorageClass</w:t>
+      </w:r>
+      <w:r>
+        <w:br/>
+      </w:r>
+      <w:r>
+        <w:rPr>
+          <w:rStyle w:val="StringTok"/>
+        </w:rPr>
+        <w:t xml:space="preserve">metadata: { name: csi-hostpath-noexpand }</w:t>
+      </w:r>
+      <w:r>
+        <w:br/>
+      </w:r>
+      <w:r>
+        <w:rPr>
+          <w:rStyle w:val="StringTok"/>
+        </w:rPr>
+        <w:t xml:space="preserve">provisioner: hostpath.csi.k8s.io</w:t>
+      </w:r>
+      <w:r>
+        <w:br/>
+      </w:r>
+      <w:r>
+        <w:rPr>
+          <w:rStyle w:val="StringTok"/>
+        </w:rPr>
+        <w:t xml:space="preserve">allowVolumeExpansion: false</w:t>
+      </w:r>
+      <w:r>
+        <w:br/>
+      </w:r>
+      <w:r>
+        <w:rPr>
+          <w:rStyle w:val="StringTok"/>
+        </w:rPr>
+        <w:t xml:space="preserve">---</w:t>
+      </w:r>
+      <w:r>
+        <w:br/>
+      </w:r>
+      <w:r>
+        <w:rPr>
+          <w:rStyle w:val="StringTok"/>
+        </w:rPr>
+        <w:t xml:space="preserve">apiVersion: v1</w:t>
+      </w:r>
+      <w:r>
+        <w:br/>
+      </w:r>
+      <w:r>
+        <w:rPr>
+          <w:rStyle w:val="StringTok"/>
+        </w:rPr>
+        <w:t xml:space="preserve">kind: PersistentVolumeClaim</w:t>
+      </w:r>
+      <w:r>
+        <w:br/>
+      </w:r>
+      <w:r>
+        <w:rPr>
+          <w:rStyle w:val="StringTok"/>
+        </w:rPr>
+        <w:t xml:space="preserve">metadata: { name: locked-pvc }</w:t>
+      </w:r>
+      <w:r>
+        <w:br/>
+      </w:r>
+      <w:r>
+        <w:rPr>
+          <w:rStyle w:val="StringTok"/>
+        </w:rPr>
+        <w:t xml:space="preserve">spec:</w:t>
+      </w:r>
+      <w:r>
+        <w:br/>
+      </w:r>
+      <w:r>
+        <w:rPr>
+          <w:rStyle w:val="StringTok"/>
+        </w:rPr>
+        <w:t xml:space="preserve">  accessModes: ["ReadWriteOnce"]</w:t>
+      </w:r>
+      <w:r>
+        <w:br/>
+      </w:r>
+      <w:r>
+        <w:rPr>
+          <w:rStyle w:val="StringTok"/>
+        </w:rPr>
+        <w:t xml:space="preserve">  storageClassName: csi-hostpath-noexpand</w:t>
+      </w:r>
+      <w:r>
+        <w:br/>
+      </w:r>
+      <w:r>
+        <w:rPr>
+          <w:rStyle w:val="StringTok"/>
+        </w:rPr>
+        <w:t xml:space="preserve">  resources: { requests: { storage: 1Gi } }</w:t>
+      </w:r>
+      <w:r>
+        <w:br/>
+      </w:r>
+      <w:r>
+        <w:rPr>
+          <w:rStyle w:val="OperatorTok"/>
+        </w:rPr>
+        <w:t xml:space="preserve">EOF</w:t>
+      </w:r>
+    </w:p>
+    <w:p>
+      <w:pPr>
+        <w:pStyle w:val="SourceCode"/>
+      </w:pPr>
+      <w:r>
+        <w:rPr>
+          <w:rStyle w:val="VerbatimChar"/>
+        </w:rPr>
+        <w:t xml:space="preserve">$ kubectl patch pvc data-shop-db-0 --type merge -p '{"spec":{"resources":{"requests":{"storage":"1Gi"}}}}'</w:t>
+      </w:r>
+      <w:r>
+        <w:br/>
+      </w:r>
+      <w:r>
+        <w:rPr>
+          <w:rStyle w:val="VerbatimChar"/>
+        </w:rPr>
+        <w:t xml:space="preserve">The PersistentVolumeClaim "data-shop-db-0" is invalid: spec.resources.requests.storage:</w:t>
+      </w:r>
+      <w:r>
+        <w:br/>
+      </w:r>
+      <w:r>
+        <w:rPr>
+          <w:rStyle w:val="VerbatimChar"/>
+        </w:rPr>
+        <w:t xml:space="preserve">Forbidden: field can not be less than status.capacity</w:t>
+      </w:r>
+      <w:r>
+        <w:br/>
+      </w:r>
+      <w:r>
+        <w:br/>
+      </w:r>
+      <w:r>
+        <w:rPr>
+          <w:rStyle w:val="VerbatimChar"/>
+        </w:rPr>
+        <w:t xml:space="preserve">$ kubectl patch pvc locked-pvc --type merge -p '{"spec":{"resources":{"requests":{"storage":"2Gi"}}}}'</w:t>
+      </w:r>
+      <w:r>
+        <w:br/>
+      </w:r>
+      <w:r>
+        <w:rPr>
+          <w:rStyle w:val="VerbatimChar"/>
+        </w:rPr>
+        <w:t xml:space="preserve">Error from server (Forbidden): persistentvolumeclaims "locked-pvc" is forbidden:</w:t>
+      </w:r>
+      <w:r>
+        <w:br/>
+      </w:r>
+      <w:r>
+        <w:rPr>
+          <w:rStyle w:val="VerbatimChar"/>
+        </w:rPr>
+        <w:t xml:space="preserve">only dynamically provisioned pvc can be resized and the storageclass that provisions</w:t>
+      </w:r>
+      <w:r>
+        <w:br/>
+      </w:r>
+      <w:r>
+        <w:rPr>
+          <w:rStyle w:val="VerbatimChar"/>
+        </w:rPr>
+        <w:t xml:space="preserve">the pvc must support resize</w:t>
+      </w:r>
+    </w:p>
+    <w:p>
+      <w:pPr>
+        <w:pStyle w:val="FirstParagraph"/>
+      </w:pPr>
+      <w:r>
+        <w:rPr>
+          <w:b/>
+          <w:bCs/>
+        </w:rPr>
+        <w:t xml:space="preserve">Volumes only grow.</w:t>
+      </w:r>
+      <w:r>
+        <w:t xml:space="preserve"> </w:t>
+      </w:r>
+      <w:r>
+        <w:t xml:space="preserve">There is no shrink in Kubernetes — the API server rejects it outright — and expansion is gated on</w:t>
+      </w:r>
+      <w:r>
+        <w:t xml:space="preserve"> </w:t>
+      </w:r>
+      <w:r>
+        <w:rPr>
+          <w:rStyle w:val="VerbatimChar"/>
+        </w:rPr>
+        <w:t xml:space="preserve">allowVolumeExpansion</w:t>
+      </w:r>
+      <w:r>
+        <w:t xml:space="preserve"> </w:t>
+      </w:r>
+      <w:r>
+        <w:t xml:space="preserve">in the</w:t>
+      </w:r>
+      <w:r>
+        <w:t xml:space="preserve"> </w:t>
+      </w:r>
+      <w:r>
+        <w:rPr>
+          <w:b/>
+          <w:bCs/>
+        </w:rPr>
+        <w:t xml:space="preserve">StorageClass</w:t>
+      </w:r>
+      <w:r>
+        <w:t xml:space="preserve">, decided at provisioning time. Pick the class correctly up front; retrofitting means migrating data.</w:t>
       </w:r>
     </w:p>
     <w:p>
@@ -6724,20 +6086,649 @@
       <w:r>
         <w:drawing>
           <wp:inline>
-            <wp:extent cx="5943600" cy="1423762"/>
+            <wp:extent cx="5943600" cy="856418"/>
             <wp:effectExtent b="0" l="0" r="0" t="0"/>
-            <wp:docPr descr="The second Pod stuck in ContainerCreating with FailedAttachVolume from the attachdetach-controller, and still only one VolumeAttachment, on the original node" title="" id="47" name="Picture"/>
+            <wp:docPr descr="Both refusals: shrinking is rejected as less than status.capacity, and expanding a claim on a class without allowVolumeExpansion is forbidden outright" title="" id="46" name="Picture"/>
             <a:graphic>
               <a:graphicData uri="http://schemas.openxmlformats.org/drawingml/2006/picture">
                 <pic:pic>
                   <pic:nvPicPr>
-                    <pic:cNvPr descr="../artifacts/lab-11/screenshots/09-multi-attach-conflict.png" id="48" name="Picture"/>
+                    <pic:cNvPr descr="../artifacts/lab-11/screenshots/08-expansion-refusals.png" id="47" name="Picture"/>
                     <pic:cNvPicPr>
                       <a:picLocks noChangeArrowheads="1" noChangeAspect="1"/>
                     </pic:cNvPicPr>
                   </pic:nvPicPr>
                   <pic:blipFill>
-                    <a:blip r:embed="rId46"/>
+                    <a:blip r:embed="rId45"/>
+                    <a:stretch>
+                      <a:fillRect/>
+                    </a:stretch>
+                  </pic:blipFill>
+                  <pic:spPr bwMode="auto">
+                    <a:xfrm>
+                      <a:off x="0" y="0"/>
+                      <a:ext cx="5943600" cy="856418"/>
+                    </a:xfrm>
+                    <a:prstGeom prst="rect">
+                      <a:avLst/>
+                    </a:prstGeom>
+                    <a:noFill/>
+                    <a:ln w="9525">
+                      <a:noFill/>
+                      <a:headEnd/>
+                      <a:tailEnd/>
+                    </a:ln>
+                  </pic:spPr>
+                </pic:pic>
+              </a:graphicData>
+            </a:graphic>
+          </wp:inline>
+        </w:drawing>
+      </w:r>
+    </w:p>
+    <w:p>
+      <w:r>
+        <w:pict>
+          <v:rect style="width:0;height:1.5pt" o:hralign="center" o:hrstd="t" o:hr="t"/>
+        </w:pict>
+      </w:r>
+    </w:p>
+    <w:bookmarkEnd w:id="48"/>
+    <w:bookmarkStart w:id="55" w:name="step-6--diagnose-a-multi-attach-failure"/>
+    <w:p>
+      <w:pPr>
+        <w:pStyle w:val="Heading2"/>
+      </w:pPr>
+      <w:r>
+        <w:t xml:space="preserve">Step 6 — Diagnose a multi-attach failure</w:t>
+      </w:r>
+    </w:p>
+    <w:p>
+      <w:pPr>
+        <w:pStyle w:val="FirstParagraph"/>
+      </w:pPr>
+      <w:r>
+        <w:rPr>
+          <w:b/>
+          <w:bCs/>
+        </w:rPr>
+        <w:t xml:space="preserve">Goal:</w:t>
+      </w:r>
+      <w:r>
+        <w:t xml:space="preserve"> </w:t>
+      </w:r>
+      <w:r>
+        <w:t xml:space="preserve">produce the classic</w:t>
+      </w:r>
+      <w:r>
+        <w:t xml:space="preserve"> </w:t>
+      </w:r>
+      <w:r>
+        <w:rPr>
+          <w:rStyle w:val="VerbatimChar"/>
+        </w:rPr>
+        <w:t xml:space="preserve">ReadWriteOnce</w:t>
+      </w:r>
+      <w:r>
+        <w:t xml:space="preserve"> </w:t>
+      </w:r>
+      <w:r>
+        <w:t xml:space="preserve">conflict on purpose, read the message correctly, and fix it — then meet the</w:t>
+      </w:r>
+      <w:r>
+        <w:t xml:space="preserve"> </w:t>
+      </w:r>
+      <w:r>
+        <w:rPr>
+          <w:i/>
+          <w:iCs/>
+        </w:rPr>
+        <w:t xml:space="preserve">second</w:t>
+      </w:r>
+      <w:r>
+        <w:t xml:space="preserve"> </w:t>
+      </w:r>
+      <w:r>
+        <w:t xml:space="preserve">failure hiding behind it.</w:t>
+      </w:r>
+    </w:p>
+    <w:p>
+      <w:pPr>
+        <w:pStyle w:val="BodyText"/>
+      </w:pPr>
+      <w:r>
+        <w:rPr>
+          <w:b/>
+          <w:bCs/>
+        </w:rPr>
+        <w:t xml:space="preserve">1. Find where the volume is attached, then deliberately put a second Pod somewhere else:</w:t>
+      </w:r>
+    </w:p>
+    <w:p>
+      <w:pPr>
+        <w:pStyle w:val="SourceCode"/>
+      </w:pPr>
+      <w:r>
+        <w:rPr>
+          <w:rStyle w:val="ExtensionTok"/>
+        </w:rPr>
+        <w:t xml:space="preserve">kubectl</w:t>
+      </w:r>
+      <w:r>
+        <w:rPr>
+          <w:rStyle w:val="NormalTok"/>
+        </w:rPr>
+        <w:t xml:space="preserve"> get pod shop-db-0 </w:t>
+      </w:r>
+      <w:r>
+        <w:rPr>
+          <w:rStyle w:val="AttributeTok"/>
+        </w:rPr>
+        <w:t xml:space="preserve">-o</w:t>
+      </w:r>
+      <w:r>
+        <w:rPr>
+          <w:rStyle w:val="NormalTok"/>
+        </w:rPr>
+        <w:t xml:space="preserve"> custom-columns=POD:.metadata.name,NODE:.spec.nodeName</w:t>
+      </w:r>
+    </w:p>
+    <w:p>
+      <w:pPr>
+        <w:pStyle w:val="SourceCode"/>
+      </w:pPr>
+      <w:r>
+        <w:rPr>
+          <w:rStyle w:val="VerbatimChar"/>
+        </w:rPr>
+        <w:t xml:space="preserve">POD         NODE</w:t>
+      </w:r>
+      <w:r>
+        <w:br/>
+      </w:r>
+      <w:r>
+        <w:rPr>
+          <w:rStyle w:val="VerbatimChar"/>
+        </w:rPr>
+        <w:t xml:space="preserve">shop-db-0   csistate-worker</w:t>
+      </w:r>
+    </w:p>
+    <w:p>
+      <w:pPr>
+        <w:pStyle w:val="SourceCode"/>
+      </w:pPr>
+      <w:r>
+        <w:rPr>
+          <w:rStyle w:val="ExtensionTok"/>
+        </w:rPr>
+        <w:t xml:space="preserve">kubectl</w:t>
+      </w:r>
+      <w:r>
+        <w:rPr>
+          <w:rStyle w:val="NormalTok"/>
+        </w:rPr>
+        <w:t xml:space="preserve"> apply </w:t>
+      </w:r>
+      <w:r>
+        <w:rPr>
+          <w:rStyle w:val="AttributeTok"/>
+        </w:rPr>
+        <w:t xml:space="preserve">-f</w:t>
+      </w:r>
+      <w:r>
+        <w:rPr>
+          <w:rStyle w:val="NormalTok"/>
+        </w:rPr>
+        <w:t xml:space="preserve"> </w:t>
+      </w:r>
+      <w:r>
+        <w:rPr>
+          <w:rStyle w:val="AttributeTok"/>
+        </w:rPr>
+        <w:t xml:space="preserve">-</w:t>
+      </w:r>
+      <w:r>
+        <w:rPr>
+          <w:rStyle w:val="NormalTok"/>
+        </w:rPr>
+        <w:t xml:space="preserve"> </w:t>
+      </w:r>
+      <w:r>
+        <w:rPr>
+          <w:rStyle w:val="OperatorTok"/>
+        </w:rPr>
+        <w:t xml:space="preserve">&lt;&lt;'EOF'</w:t>
+      </w:r>
+      <w:r>
+        <w:br/>
+      </w:r>
+      <w:r>
+        <w:rPr>
+          <w:rStyle w:val="StringTok"/>
+        </w:rPr>
+        <w:t xml:space="preserve">apiVersion: v1</w:t>
+      </w:r>
+      <w:r>
+        <w:br/>
+      </w:r>
+      <w:r>
+        <w:rPr>
+          <w:rStyle w:val="StringTok"/>
+        </w:rPr>
+        <w:t xml:space="preserve">kind: Pod</w:t>
+      </w:r>
+      <w:r>
+        <w:br/>
+      </w:r>
+      <w:r>
+        <w:rPr>
+          <w:rStyle w:val="StringTok"/>
+        </w:rPr>
+        <w:t xml:space="preserve">metadata: { name: report-runner }</w:t>
+      </w:r>
+      <w:r>
+        <w:br/>
+      </w:r>
+      <w:r>
+        <w:rPr>
+          <w:rStyle w:val="StringTok"/>
+        </w:rPr>
+        <w:t xml:space="preserve">spec:</w:t>
+      </w:r>
+      <w:r>
+        <w:br/>
+      </w:r>
+      <w:r>
+        <w:rPr>
+          <w:rStyle w:val="StringTok"/>
+        </w:rPr>
+        <w:t xml:space="preserve">  nodeName: csistate-worker2          # &lt;- the OTHER worker, on purpose</w:t>
+      </w:r>
+      <w:r>
+        <w:br/>
+      </w:r>
+      <w:r>
+        <w:rPr>
+          <w:rStyle w:val="StringTok"/>
+        </w:rPr>
+        <w:t xml:space="preserve">  containers:</w:t>
+      </w:r>
+      <w:r>
+        <w:br/>
+      </w:r>
+      <w:r>
+        <w:rPr>
+          <w:rStyle w:val="StringTok"/>
+        </w:rPr>
+        <w:t xml:space="preserve">    - name: app</w:t>
+      </w:r>
+      <w:r>
+        <w:br/>
+      </w:r>
+      <w:r>
+        <w:rPr>
+          <w:rStyle w:val="StringTok"/>
+        </w:rPr>
+        <w:t xml:space="preserve">      image: busybox:1.36</w:t>
+      </w:r>
+      <w:r>
+        <w:br/>
+      </w:r>
+      <w:r>
+        <w:rPr>
+          <w:rStyle w:val="StringTok"/>
+        </w:rPr>
+        <w:t xml:space="preserve">      command: ["sh","-c","cat /data/message; sleep 100000"]</w:t>
+      </w:r>
+      <w:r>
+        <w:br/>
+      </w:r>
+      <w:r>
+        <w:rPr>
+          <w:rStyle w:val="StringTok"/>
+        </w:rPr>
+        <w:t xml:space="preserve">      volumeMounts: [{ name: data, mountPath: /data }]</w:t>
+      </w:r>
+      <w:r>
+        <w:br/>
+      </w:r>
+      <w:r>
+        <w:rPr>
+          <w:rStyle w:val="StringTok"/>
+        </w:rPr>
+        <w:t xml:space="preserve">  volumes:</w:t>
+      </w:r>
+      <w:r>
+        <w:br/>
+      </w:r>
+      <w:r>
+        <w:rPr>
+          <w:rStyle w:val="StringTok"/>
+        </w:rPr>
+        <w:t xml:space="preserve">    - name: data</w:t>
+      </w:r>
+      <w:r>
+        <w:br/>
+      </w:r>
+      <w:r>
+        <w:rPr>
+          <w:rStyle w:val="StringTok"/>
+        </w:rPr>
+        <w:t xml:space="preserve">      persistentVolumeClaim: { claimName: data-shop-db-0 }</w:t>
+      </w:r>
+      <w:r>
+        <w:br/>
+      </w:r>
+      <w:r>
+        <w:rPr>
+          <w:rStyle w:val="OperatorTok"/>
+        </w:rPr>
+        <w:t xml:space="preserve">EOF</w:t>
+      </w:r>
+    </w:p>
+    <w:p>
+      <w:pPr>
+        <w:pStyle w:val="FirstParagraph"/>
+      </w:pPr>
+      <w:r>
+        <w:rPr>
+          <w:b/>
+          <w:bCs/>
+        </w:rPr>
+        <w:t xml:space="preserve">2. It hangs in</w:t>
+      </w:r>
+      <w:r>
+        <w:rPr>
+          <w:b/>
+          <w:bCs/>
+        </w:rPr>
+        <w:t xml:space="preserve"> </w:t>
+      </w:r>
+      <w:r>
+        <w:rPr>
+          <w:rStyle w:val="VerbatimChar"/>
+          <w:b/>
+          <w:bCs/>
+        </w:rPr>
+        <w:t xml:space="preserve">ContainerCreating</w:t>
+      </w:r>
+      <w:r>
+        <w:rPr>
+          <w:b/>
+          <w:bCs/>
+        </w:rPr>
+        <w:t xml:space="preserve">. Get the reason from the events:</w:t>
+      </w:r>
+    </w:p>
+    <w:p>
+      <w:pPr>
+        <w:pStyle w:val="SourceCode"/>
+      </w:pPr>
+      <w:r>
+        <w:rPr>
+          <w:rStyle w:val="VerbatimChar"/>
+        </w:rPr>
+        <w:t xml:space="preserve">$ kubectl get pod report-runner</w:t>
+      </w:r>
+      <w:r>
+        <w:br/>
+      </w:r>
+      <w:r>
+        <w:rPr>
+          <w:rStyle w:val="VerbatimChar"/>
+        </w:rPr>
+        <w:t xml:space="preserve">NAME            READY   STATUS              RESTARTS   AGE</w:t>
+      </w:r>
+      <w:r>
+        <w:br/>
+      </w:r>
+      <w:r>
+        <w:rPr>
+          <w:rStyle w:val="VerbatimChar"/>
+        </w:rPr>
+        <w:t xml:space="preserve">report-runner   0/1     ContainerCreating   0          45s</w:t>
+      </w:r>
+      <w:r>
+        <w:br/>
+      </w:r>
+      <w:r>
+        <w:br/>
+      </w:r>
+      <w:r>
+        <w:rPr>
+          <w:rStyle w:val="VerbatimChar"/>
+        </w:rPr>
+        <w:t xml:space="preserve">$ kubectl describe pod report-runner | sed -n '/Events/,$p'</w:t>
+      </w:r>
+      <w:r>
+        <w:br/>
+      </w:r>
+      <w:r>
+        <w:rPr>
+          <w:rStyle w:val="VerbatimChar"/>
+        </w:rPr>
+        <w:t xml:space="preserve">Warning  FailedAttachVolume  46s  attachdetach-controller  Waiting for detach for volume</w:t>
+      </w:r>
+      <w:r>
+        <w:br/>
+      </w:r>
+      <w:r>
+        <w:rPr>
+          <w:rStyle w:val="VerbatimChar"/>
+        </w:rPr>
+        <w:t xml:space="preserve">  "pvc-f833ee26-…" Volume is already used by pod(s) shop-db-0</w:t>
+      </w:r>
+      <w:r>
+        <w:br/>
+      </w:r>
+      <w:r>
+        <w:br/>
+      </w:r>
+      <w:r>
+        <w:rPr>
+          <w:rStyle w:val="VerbatimChar"/>
+        </w:rPr>
+        <w:t xml:space="preserve">$ kubectl get volumeattachment -o custom-columns=NODE:.spec.nodeName,ATTACHED:.status.attached</w:t>
+      </w:r>
+      <w:r>
+        <w:br/>
+      </w:r>
+      <w:r>
+        <w:rPr>
+          <w:rStyle w:val="VerbatimChar"/>
+        </w:rPr>
+        <w:t xml:space="preserve">NODE               ATTACHED</w:t>
+      </w:r>
+      <w:r>
+        <w:br/>
+      </w:r>
+      <w:r>
+        <w:rPr>
+          <w:rStyle w:val="VerbatimChar"/>
+        </w:rPr>
+        <w:t xml:space="preserve">csistate-worker   true</w:t>
+      </w:r>
+    </w:p>
+    <w:p>
+      <w:pPr>
+        <w:pStyle w:val="FirstParagraph"/>
+      </w:pPr>
+      <w:r>
+        <w:rPr>
+          <w:b/>
+          <w:bCs/>
+        </w:rPr>
+        <w:t xml:space="preserve">What this means.</w:t>
+      </w:r>
+      <w:r>
+        <w:t xml:space="preserve"> </w:t>
+      </w:r>
+      <w:r>
+        <w:t xml:space="preserve">A</w:t>
+      </w:r>
+      <w:r>
+        <w:t xml:space="preserve"> </w:t>
+      </w:r>
+      <w:r>
+        <w:rPr>
+          <w:rStyle w:val="VerbatimChar"/>
+        </w:rPr>
+        <w:t xml:space="preserve">ReadWriteOnce</w:t>
+      </w:r>
+      <w:r>
+        <w:t xml:space="preserve"> </w:t>
+      </w:r>
+      <w:r>
+        <w:t xml:space="preserve">volume can be attached to</w:t>
+      </w:r>
+      <w:r>
+        <w:t xml:space="preserve"> </w:t>
+      </w:r>
+      <w:r>
+        <w:rPr>
+          <w:b/>
+          <w:bCs/>
+        </w:rPr>
+        <w:t xml:space="preserve">one node</w:t>
+      </w:r>
+      <w:r>
+        <w:t xml:space="preserve"> </w:t>
+      </w:r>
+      <w:r>
+        <w:t xml:space="preserve">at a time. The</w:t>
+      </w:r>
+      <w:r>
+        <w:t xml:space="preserve"> </w:t>
+      </w:r>
+      <w:r>
+        <w:rPr>
+          <w:rStyle w:val="VerbatimChar"/>
+        </w:rPr>
+        <w:t xml:space="preserve">attachdetach-controller</w:t>
+      </w:r>
+      <w:r>
+        <w:t xml:space="preserve"> </w:t>
+      </w:r>
+      <w:r>
+        <w:t xml:space="preserve">in</w:t>
+      </w:r>
+      <w:r>
+        <w:t xml:space="preserve"> </w:t>
+      </w:r>
+      <w:r>
+        <w:rPr>
+          <w:rStyle w:val="VerbatimChar"/>
+        </w:rPr>
+        <w:t xml:space="preserve">kube-controller-manager</w:t>
+      </w:r>
+      <w:r>
+        <w:t xml:space="preserve"> </w:t>
+      </w:r>
+      <w:r>
+        <w:t xml:space="preserve">sees an existing</w:t>
+      </w:r>
+      <w:r>
+        <w:t xml:space="preserve"> </w:t>
+      </w:r>
+      <w:r>
+        <w:rPr>
+          <w:rStyle w:val="VerbatimChar"/>
+        </w:rPr>
+        <w:t xml:space="preserve">VolumeAttachment</w:t>
+      </w:r>
+      <w:r>
+        <w:t xml:space="preserve"> </w:t>
+      </w:r>
+      <w:r>
+        <w:t xml:space="preserve">for</w:t>
+      </w:r>
+      <w:r>
+        <w:t xml:space="preserve"> </w:t>
+      </w:r>
+      <w:r>
+        <w:rPr>
+          <w:rStyle w:val="VerbatimChar"/>
+        </w:rPr>
+        <w:t xml:space="preserve">csistate-worker</w:t>
+      </w:r>
+      <w:r>
+        <w:t xml:space="preserve"> </w:t>
+      </w:r>
+      <w:r>
+        <w:t xml:space="preserve">and refuses to create a second one for</w:t>
+      </w:r>
+      <w:r>
+        <w:t xml:space="preserve"> </w:t>
+      </w:r>
+      <w:r>
+        <w:rPr>
+          <w:rStyle w:val="VerbatimChar"/>
+        </w:rPr>
+        <w:t xml:space="preserve">csistate-worker2</w:t>
+      </w:r>
+      <w:r>
+        <w:t xml:space="preserve">. Notice there is still exactly</w:t>
+      </w:r>
+      <w:r>
+        <w:t xml:space="preserve"> </w:t>
+      </w:r>
+      <w:r>
+        <w:rPr>
+          <w:b/>
+          <w:bCs/>
+        </w:rPr>
+        <w:t xml:space="preserve">one</w:t>
+      </w:r>
+      <w:r>
+        <w:t xml:space="preserve"> </w:t>
+      </w:r>
+      <w:r>
+        <w:rPr>
+          <w:rStyle w:val="VerbatimChar"/>
+        </w:rPr>
+        <w:t xml:space="preserve">VolumeAttachment</w:t>
+      </w:r>
+      <w:r>
+        <w:t xml:space="preserve"> </w:t>
+      </w:r>
+      <w:r>
+        <w:t xml:space="preserve">— the conflict is resolved by</w:t>
+      </w:r>
+      <w:r>
+        <w:t xml:space="preserve"> </w:t>
+      </w:r>
+      <w:r>
+        <w:rPr>
+          <w:i/>
+          <w:iCs/>
+        </w:rPr>
+        <w:t xml:space="preserve">not acting</w:t>
+      </w:r>
+      <w:r>
+        <w:t xml:space="preserve">, which is why the Pod waits forever rather than failing.</w:t>
+      </w:r>
+    </w:p>
+    <w:p>
+      <w:pPr>
+        <w:pStyle w:val="BodyText"/>
+      </w:pPr>
+      <w:r>
+        <w:drawing>
+          <wp:inline>
+            <wp:extent cx="5943600" cy="1423762"/>
+            <wp:effectExtent b="0" l="0" r="0" t="0"/>
+            <wp:docPr descr="The second Pod stuck in ContainerCreating with FailedAttachVolume from the attachdetach-controller, and still only one VolumeAttachment, on the original node" title="" id="50" name="Picture"/>
+            <a:graphic>
+              <a:graphicData uri="http://schemas.openxmlformats.org/drawingml/2006/picture">
+                <pic:pic>
+                  <pic:nvPicPr>
+                    <pic:cNvPr descr="../artifacts/lab-11/screenshots/09-multi-attach-conflict.png" id="51" name="Picture"/>
+                    <pic:cNvPicPr>
+                      <a:picLocks noChangeArrowheads="1" noChangeAspect="1"/>
+                    </pic:cNvPicPr>
+                  </pic:nvPicPr>
+                  <pic:blipFill>
+                    <a:blip r:embed="rId49"/>
                     <a:stretch>
                       <a:fillRect/>
                     </a:stretch>
@@ -7498,18 +7489,18 @@
           <wp:inline>
             <wp:extent cx="5943600" cy="1585860"/>
             <wp:effectExtent b="0" l="0" r="0" t="0"/>
-            <wp:docPr descr="Once the volume detaches the attach succeeds, and kubelet then refuses the mount with a NodeAffinity check failure — the PV is pinned by topology.hostpath.csi/node to the one node that runs the driver" title="" id="50" name="Picture"/>
+            <wp:docPr descr="Once the volume detaches the attach succeeds, and kubelet then refuses the mount with a NodeAffinity check failure — the PV is pinned by topology.hostpath.csi/node to the one node that runs the driver" title="" id="53" name="Picture"/>
             <a:graphic>
               <a:graphicData uri="http://schemas.openxmlformats.org/drawingml/2006/picture">
                 <pic:pic>
                   <pic:nvPicPr>
-                    <pic:cNvPr descr="../artifacts/lab-11/screenshots/10-node-affinity-pinned-volume.png" id="51" name="Picture"/>
+                    <pic:cNvPr descr="../artifacts/lab-11/screenshots/10-node-affinity-pinned-volume.png" id="54" name="Picture"/>
                     <pic:cNvPicPr>
                       <a:picLocks noChangeArrowheads="1" noChangeAspect="1"/>
                     </pic:cNvPicPr>
                   </pic:nvPicPr>
                   <pic:blipFill>
-                    <a:blip r:embed="rId49"/>
+                    <a:blip r:embed="rId52"/>
                     <a:stretch>
                       <a:fillRect/>
                     </a:stretch>
@@ -7660,8 +7651,8 @@
         </w:pict>
       </w:r>
     </w:p>
-    <w:bookmarkEnd w:id="52"/>
-    <w:bookmarkStart w:id="59" w:name="Xf5af6d33e3ffc2fe594a31ed4ba4a276cbea622"/>
+    <w:bookmarkEnd w:id="55"/>
+    <w:bookmarkStart w:id="62" w:name="Xf5af6d33e3ffc2fe594a31ed4ba4a276cbea622"/>
     <w:p>
       <w:pPr>
         <w:pStyle w:val="Heading2"/>
@@ -8081,18 +8072,18 @@
           <wp:inline>
             <wp:extent cx="5943600" cy="1099566"/>
             <wp:effectExtent b="0" l="0" r="0" t="0"/>
-            <wp:docPr descr="The deleted PVC sitting in Terminating with a deletionTimestamp and the kubernetes.io/pvc-protection finalizer, while the volume still serves reads" title="" id="54" name="Picture"/>
+            <wp:docPr descr="The deleted PVC sitting in Terminating with a deletionTimestamp and the kubernetes.io/pvc-protection finalizer, while the volume still serves reads" title="" id="57" name="Picture"/>
             <a:graphic>
               <a:graphicData uri="http://schemas.openxmlformats.org/drawingml/2006/picture">
                 <pic:pic>
                   <pic:nvPicPr>
-                    <pic:cNvPr descr="../artifacts/lab-11/screenshots/11-pvc-finalizer-holds-deletion.png" id="55" name="Picture"/>
+                    <pic:cNvPr descr="../artifacts/lab-11/screenshots/11-pvc-finalizer-holds-deletion.png" id="58" name="Picture"/>
                     <pic:cNvPicPr>
                       <a:picLocks noChangeArrowheads="1" noChangeAspect="1"/>
                     </pic:cNvPicPr>
                   </pic:nvPicPr>
                   <pic:blipFill>
-                    <a:blip r:embed="rId53"/>
+                    <a:blip r:embed="rId56"/>
                     <a:stretch>
                       <a:fillRect/>
                     </a:stretch>
@@ -9310,18 +9301,18 @@
           <wp:inline>
             <wp:extent cx="5943600" cy="1423762"/>
             <wp:effectExtent b="0" l="0" r="0" t="0"/>
-            <wp:docPr descr="The clone bound alongside its source, carrying the source's data, then diverging when written to while the source stays unchanged" title="" id="57" name="Picture"/>
+            <wp:docPr descr="The clone bound alongside its source, carrying the source's data, then diverging when written to while the source stays unchanged" title="" id="60" name="Picture"/>
             <a:graphic>
               <a:graphicData uri="http://schemas.openxmlformats.org/drawingml/2006/picture">
                 <pic:pic>
                   <pic:nvPicPr>
-                    <pic:cNvPr descr="../artifacts/lab-11/screenshots/12-volume-clone.png" id="58" name="Picture"/>
+                    <pic:cNvPr descr="../artifacts/lab-11/screenshots/12-volume-clone.png" id="61" name="Picture"/>
                     <pic:cNvPicPr>
                       <a:picLocks noChangeArrowheads="1" noChangeAspect="1"/>
                     </pic:cNvPicPr>
                   </pic:nvPicPr>
                   <pic:blipFill>
-                    <a:blip r:embed="rId56"/>
+                    <a:blip r:embed="rId59"/>
                     <a:stretch>
                       <a:fillRect/>
                     </a:stretch>
@@ -9355,8 +9346,8 @@
         </w:pict>
       </w:r>
     </w:p>
-    <w:bookmarkEnd w:id="59"/>
-    <w:bookmarkStart w:id="60" w:name="step-8--clean-up"/>
+    <w:bookmarkEnd w:id="62"/>
+    <w:bookmarkStart w:id="63" w:name="step-8--clean-up"/>
     <w:p>
       <w:pPr>
         <w:pStyle w:val="Heading2"/>
@@ -9506,8 +9497,8 @@
         </w:pict>
       </w:r>
     </w:p>
-    <w:bookmarkEnd w:id="60"/>
-    <w:bookmarkStart w:id="61" w:name="what-you-learned"/>
+    <w:bookmarkEnd w:id="63"/>
+    <w:bookmarkStart w:id="64" w:name="what-you-learned"/>
     <w:p>
       <w:pPr>
         <w:pStyle w:val="Heading2"/>
@@ -10320,8 +10311,8 @@
         </w:tc>
       </w:tr>
     </w:tbl>
-    <w:bookmarkEnd w:id="61"/>
-    <w:bookmarkStart w:id="64" w:name="evidence"/>
+    <w:bookmarkEnd w:id="64"/>
+    <w:bookmarkStart w:id="67" w:name="evidence"/>
     <w:p>
       <w:pPr>
         <w:pStyle w:val="Heading2"/>
@@ -10340,7 +10331,7 @@
       <w:r>
         <w:t xml:space="preserve"> </w:t>
       </w:r>
-      <w:hyperlink r:id="rId62">
+      <w:hyperlink r:id="rId65">
         <w:r>
           <w:rPr>
             <w:rStyle w:val="VerbatimChar"/>
@@ -10357,7 +10348,7 @@
       <w:r>
         <w:t xml:space="preserve"> </w:t>
       </w:r>
-      <w:hyperlink r:id="rId63">
+      <w:hyperlink r:id="rId66">
         <w:r>
           <w:rPr>
             <w:rStyle w:val="VerbatimChar"/>
@@ -10374,7 +10365,7 @@
       <w:r>
         <w:t xml:space="preserve"> </w:t>
       </w:r>
-      <w:hyperlink r:id="rId34">
+      <w:hyperlink r:id="rId37">
         <w:r>
           <w:rPr>
             <w:rStyle w:val="VerbatimChar"/>
@@ -10417,7 +10408,7 @@
       <w:r>
         <w:t xml:space="preserve"> </w:t>
       </w:r>
-      <w:hyperlink r:id="rId29">
+      <w:hyperlink r:id="rId32">
         <w:r>
           <w:rPr>
             <w:rStyle w:val="Hyperlink"/>
@@ -10426,7 +10417,7 @@
         </w:r>
       </w:hyperlink>
     </w:p>
-    <w:bookmarkEnd w:id="64"/>
+    <w:bookmarkEnd w:id="67"/>
     <w:sectPr>
       <w:pgSz w:h="15840" w:w="12240"/>
       <w:pgMar w:bottom="1440" w:footer="720" w:gutter="0" w:header="720" w:left="1440" w:right="1440" w:top="1440"/>

</xml_diff>